<commit_message>
refactor(demo): align Card pipeline with new sp.regtable full-coef default
Drop 8 misaligned `keep=["educ"]` filters from the Card (1995) pipeline
so Tables 2/2c/2d/3/A1 (and the corresponding sp.collect bundle entries)
show every estimated parameter — controls AND intercept — per the new
StatsPAI skill convention. The 3 legitimate focal-only uses (IV
first-stage triplet × 2 + interaction-form heterogeneity × 1) are
preserved. Headline numbers unchanged: OLS β=0.075, 2SLS β=0.132,
first-stage F=14.14, Oster δ*=16.4.

Co-Authored-By: Claude Opus 4.7 (1M context) <noreply@anthropic.com>
</commit_message>
<xml_diff>
--- a/demo-StatsPAI-skill/tables/table2_main_ols.docx
+++ b/demo-StatsPAI-skill/tables/table2_main_ols.docx
@@ -155,6 +155,269 @@
                 <w:sz w:val="20"/>
               </w:rPr>
               <w:t>(4) +Region FE</w:t>
+            </w:r>
+          </w:p>
+        </w:tc>
+      </w:tr>
+      <w:tr>
+        <w:tc>
+          <w:tcPr>
+            <w:tcW w:type="dxa" w:w="1728"/>
+            <w:vAlign w:val="center"/>
+            <w:tcBorders>
+              <w:top w:val="nil"/>
+              <w:left w:val="nil"/>
+              <w:bottom w:val="nil"/>
+              <w:right w:val="nil"/>
+              <w:insideH w:val="nil"/>
+              <w:insideV w:val="nil"/>
+            </w:tcBorders>
+          </w:tcPr>
+          <w:p>
+            <w:pPr>
+              <w:jc w:val="left"/>
+            </w:pPr>
+            <w:r>
+              <w:rPr>
+                <w:rFonts w:ascii="Times New Roman" w:hAnsi="Times New Roman"/>
+                <w:sz w:val="20"/>
+              </w:rPr>
+              <w:t>Intercept</w:t>
+            </w:r>
+          </w:p>
+        </w:tc>
+        <w:tc>
+          <w:tcPr>
+            <w:tcW w:type="dxa" w:w="1728"/>
+            <w:vAlign w:val="center"/>
+            <w:tcBorders>
+              <w:top w:val="nil"/>
+              <w:left w:val="nil"/>
+              <w:bottom w:val="nil"/>
+              <w:right w:val="nil"/>
+              <w:insideH w:val="nil"/>
+              <w:insideV w:val="nil"/>
+            </w:tcBorders>
+          </w:tcPr>
+          <w:p>
+            <w:pPr>
+              <w:jc w:val="center"/>
+            </w:pPr>
+            <w:r>
+              <w:rPr>
+                <w:rFonts w:ascii="Times New Roman" w:hAnsi="Times New Roman"/>
+                <w:sz w:val="20"/>
+              </w:rPr>
+              <w:t>5.571***</w:t>
+            </w:r>
+          </w:p>
+        </w:tc>
+        <w:tc>
+          <w:tcPr>
+            <w:tcW w:type="dxa" w:w="1728"/>
+            <w:vAlign w:val="center"/>
+            <w:tcBorders>
+              <w:top w:val="nil"/>
+              <w:left w:val="nil"/>
+              <w:bottom w:val="nil"/>
+              <w:right w:val="nil"/>
+              <w:insideH w:val="nil"/>
+              <w:insideV w:val="nil"/>
+            </w:tcBorders>
+          </w:tcPr>
+          <w:p>
+            <w:pPr>
+              <w:jc w:val="center"/>
+            </w:pPr>
+            <w:r>
+              <w:rPr>
+                <w:rFonts w:ascii="Times New Roman" w:hAnsi="Times New Roman"/>
+                <w:sz w:val="20"/>
+              </w:rPr>
+              <w:t>4.469***</w:t>
+            </w:r>
+          </w:p>
+        </w:tc>
+        <w:tc>
+          <w:tcPr>
+            <w:tcW w:type="dxa" w:w="1728"/>
+            <w:vAlign w:val="center"/>
+            <w:tcBorders>
+              <w:top w:val="nil"/>
+              <w:left w:val="nil"/>
+              <w:bottom w:val="nil"/>
+              <w:right w:val="nil"/>
+              <w:insideH w:val="nil"/>
+              <w:insideV w:val="nil"/>
+            </w:tcBorders>
+          </w:tcPr>
+          <w:p>
+            <w:pPr>
+              <w:jc w:val="center"/>
+            </w:pPr>
+            <w:r>
+              <w:rPr>
+                <w:rFonts w:ascii="Times New Roman" w:hAnsi="Times New Roman"/>
+                <w:sz w:val="20"/>
+              </w:rPr>
+              <w:t>4.734***</w:t>
+            </w:r>
+          </w:p>
+        </w:tc>
+        <w:tc>
+          <w:tcPr>
+            <w:tcW w:type="dxa" w:w="1728"/>
+            <w:vAlign w:val="center"/>
+            <w:tcBorders>
+              <w:top w:val="nil"/>
+              <w:left w:val="nil"/>
+              <w:bottom w:val="nil"/>
+              <w:right w:val="nil"/>
+              <w:insideH w:val="nil"/>
+              <w:insideV w:val="nil"/>
+            </w:tcBorders>
+          </w:tcPr>
+          <w:p>
+            <w:pPr>
+              <w:jc w:val="center"/>
+            </w:pPr>
+            <w:r>
+              <w:rPr>
+                <w:rFonts w:ascii="Times New Roman" w:hAnsi="Times New Roman"/>
+                <w:sz w:val="20"/>
+              </w:rPr>
+              <w:t>4.621***</w:t>
+            </w:r>
+          </w:p>
+        </w:tc>
+      </w:tr>
+      <w:tr>
+        <w:tc>
+          <w:tcPr>
+            <w:tcW w:type="dxa" w:w="1728"/>
+            <w:vAlign w:val="center"/>
+            <w:tcBorders>
+              <w:top w:val="nil"/>
+              <w:left w:val="nil"/>
+              <w:bottom w:val="nil"/>
+              <w:right w:val="nil"/>
+              <w:insideH w:val="nil"/>
+              <w:insideV w:val="nil"/>
+            </w:tcBorders>
+          </w:tcPr>
+          <w:p>
+            <w:pPr>
+              <w:jc w:val="left"/>
+            </w:pPr>
+            <w:r>
+              <w:rPr>
+                <w:rFonts w:ascii="Times New Roman" w:hAnsi="Times New Roman"/>
+                <w:sz w:val="20"/>
+              </w:rPr>
+            </w:r>
+          </w:p>
+        </w:tc>
+        <w:tc>
+          <w:tcPr>
+            <w:tcW w:type="dxa" w:w="1728"/>
+            <w:vAlign w:val="center"/>
+            <w:tcBorders>
+              <w:top w:val="nil"/>
+              <w:left w:val="nil"/>
+              <w:bottom w:val="nil"/>
+              <w:right w:val="nil"/>
+              <w:insideH w:val="nil"/>
+              <w:insideV w:val="nil"/>
+            </w:tcBorders>
+          </w:tcPr>
+          <w:p>
+            <w:pPr>
+              <w:jc w:val="center"/>
+            </w:pPr>
+            <w:r>
+              <w:rPr>
+                <w:rFonts w:ascii="Times New Roman" w:hAnsi="Times New Roman"/>
+                <w:sz w:val="20"/>
+              </w:rPr>
+              <w:t>(0.039)</w:t>
+            </w:r>
+          </w:p>
+        </w:tc>
+        <w:tc>
+          <w:tcPr>
+            <w:tcW w:type="dxa" w:w="1728"/>
+            <w:vAlign w:val="center"/>
+            <w:tcBorders>
+              <w:top w:val="nil"/>
+              <w:left w:val="nil"/>
+              <w:bottom w:val="nil"/>
+              <w:right w:val="nil"/>
+              <w:insideH w:val="nil"/>
+              <w:insideV w:val="nil"/>
+            </w:tcBorders>
+          </w:tcPr>
+          <w:p>
+            <w:pPr>
+              <w:jc w:val="center"/>
+            </w:pPr>
+            <w:r>
+              <w:rPr>
+                <w:rFonts w:ascii="Times New Roman" w:hAnsi="Times New Roman"/>
+                <w:sz w:val="20"/>
+              </w:rPr>
+              <w:t>(0.070)</w:t>
+            </w:r>
+          </w:p>
+        </w:tc>
+        <w:tc>
+          <w:tcPr>
+            <w:tcW w:type="dxa" w:w="1728"/>
+            <w:vAlign w:val="center"/>
+            <w:tcBorders>
+              <w:top w:val="nil"/>
+              <w:left w:val="nil"/>
+              <w:bottom w:val="nil"/>
+              <w:right w:val="nil"/>
+              <w:insideH w:val="nil"/>
+              <w:insideV w:val="nil"/>
+            </w:tcBorders>
+          </w:tcPr>
+          <w:p>
+            <w:pPr>
+              <w:jc w:val="center"/>
+            </w:pPr>
+            <w:r>
+              <w:rPr>
+                <w:rFonts w:ascii="Times New Roman" w:hAnsi="Times New Roman"/>
+                <w:sz w:val="20"/>
+              </w:rPr>
+              <w:t>(0.070)</w:t>
+            </w:r>
+          </w:p>
+        </w:tc>
+        <w:tc>
+          <w:tcPr>
+            <w:tcW w:type="dxa" w:w="1728"/>
+            <w:vAlign w:val="center"/>
+            <w:tcBorders>
+              <w:top w:val="nil"/>
+              <w:left w:val="nil"/>
+              <w:bottom w:val="nil"/>
+              <w:right w:val="nil"/>
+              <w:insideH w:val="nil"/>
+              <w:insideV w:val="nil"/>
+            </w:tcBorders>
+          </w:tcPr>
+          <w:p>
+            <w:pPr>
+              <w:jc w:val="center"/>
+            </w:pPr>
+            <w:r>
+              <w:rPr>
+                <w:rFonts w:ascii="Times New Roman" w:hAnsi="Times New Roman"/>
+                <w:sz w:val="20"/>
+              </w:rPr>
+              <w:t>(0.074)</w:t>
             </w:r>
           </w:p>
         </w:tc>
@@ -445,6 +708,3618 @@
                 <w:rFonts w:ascii="Times New Roman" w:hAnsi="Times New Roman"/>
                 <w:sz w:val="20"/>
               </w:rPr>
+              <w:t>exper</w:t>
+            </w:r>
+          </w:p>
+        </w:tc>
+        <w:tc>
+          <w:tcPr>
+            <w:tcW w:type="dxa" w:w="1728"/>
+            <w:vAlign w:val="center"/>
+            <w:tcBorders>
+              <w:top w:val="nil"/>
+              <w:left w:val="nil"/>
+              <w:bottom w:val="nil"/>
+              <w:right w:val="nil"/>
+              <w:insideH w:val="nil"/>
+              <w:insideV w:val="nil"/>
+            </w:tcBorders>
+          </w:tcPr>
+          <w:p>
+            <w:pPr>
+              <w:jc w:val="center"/>
+            </w:pPr>
+            <w:r>
+              <w:rPr>
+                <w:rFonts w:ascii="Times New Roman" w:hAnsi="Times New Roman"/>
+                <w:sz w:val="20"/>
+              </w:rPr>
+            </w:r>
+          </w:p>
+        </w:tc>
+        <w:tc>
+          <w:tcPr>
+            <w:tcW w:type="dxa" w:w="1728"/>
+            <w:vAlign w:val="center"/>
+            <w:tcBorders>
+              <w:top w:val="nil"/>
+              <w:left w:val="nil"/>
+              <w:bottom w:val="nil"/>
+              <w:right w:val="nil"/>
+              <w:insideH w:val="nil"/>
+              <w:insideV w:val="nil"/>
+            </w:tcBorders>
+          </w:tcPr>
+          <w:p>
+            <w:pPr>
+              <w:jc w:val="center"/>
+            </w:pPr>
+            <w:r>
+              <w:rPr>
+                <w:rFonts w:ascii="Times New Roman" w:hAnsi="Times New Roman"/>
+                <w:sz w:val="20"/>
+              </w:rPr>
+              <w:t>0.090***</w:t>
+            </w:r>
+          </w:p>
+        </w:tc>
+        <w:tc>
+          <w:tcPr>
+            <w:tcW w:type="dxa" w:w="1728"/>
+            <w:vAlign w:val="center"/>
+            <w:tcBorders>
+              <w:top w:val="nil"/>
+              <w:left w:val="nil"/>
+              <w:bottom w:val="nil"/>
+              <w:right w:val="nil"/>
+              <w:insideH w:val="nil"/>
+              <w:insideV w:val="nil"/>
+            </w:tcBorders>
+          </w:tcPr>
+          <w:p>
+            <w:pPr>
+              <w:jc w:val="center"/>
+            </w:pPr>
+            <w:r>
+              <w:rPr>
+                <w:rFonts w:ascii="Times New Roman" w:hAnsi="Times New Roman"/>
+                <w:sz w:val="20"/>
+              </w:rPr>
+              <w:t>0.084***</w:t>
+            </w:r>
+          </w:p>
+        </w:tc>
+        <w:tc>
+          <w:tcPr>
+            <w:tcW w:type="dxa" w:w="1728"/>
+            <w:vAlign w:val="center"/>
+            <w:tcBorders>
+              <w:top w:val="nil"/>
+              <w:left w:val="nil"/>
+              <w:bottom w:val="nil"/>
+              <w:right w:val="nil"/>
+              <w:insideH w:val="nil"/>
+              <w:insideV w:val="nil"/>
+            </w:tcBorders>
+          </w:tcPr>
+          <w:p>
+            <w:pPr>
+              <w:jc w:val="center"/>
+            </w:pPr>
+            <w:r>
+              <w:rPr>
+                <w:rFonts w:ascii="Times New Roman" w:hAnsi="Times New Roman"/>
+                <w:sz w:val="20"/>
+              </w:rPr>
+              <w:t>0.085***</w:t>
+            </w:r>
+          </w:p>
+        </w:tc>
+      </w:tr>
+      <w:tr>
+        <w:tc>
+          <w:tcPr>
+            <w:tcW w:type="dxa" w:w="1728"/>
+            <w:vAlign w:val="center"/>
+            <w:tcBorders>
+              <w:top w:val="nil"/>
+              <w:left w:val="nil"/>
+              <w:bottom w:val="nil"/>
+              <w:right w:val="nil"/>
+              <w:insideH w:val="nil"/>
+              <w:insideV w:val="nil"/>
+            </w:tcBorders>
+          </w:tcPr>
+          <w:p>
+            <w:pPr>
+              <w:jc w:val="left"/>
+            </w:pPr>
+            <w:r>
+              <w:rPr>
+                <w:rFonts w:ascii="Times New Roman" w:hAnsi="Times New Roman"/>
+                <w:sz w:val="20"/>
+              </w:rPr>
+            </w:r>
+          </w:p>
+        </w:tc>
+        <w:tc>
+          <w:tcPr>
+            <w:tcW w:type="dxa" w:w="1728"/>
+            <w:vAlign w:val="center"/>
+            <w:tcBorders>
+              <w:top w:val="nil"/>
+              <w:left w:val="nil"/>
+              <w:bottom w:val="nil"/>
+              <w:right w:val="nil"/>
+              <w:insideH w:val="nil"/>
+              <w:insideV w:val="nil"/>
+            </w:tcBorders>
+          </w:tcPr>
+          <w:p>
+            <w:pPr>
+              <w:jc w:val="center"/>
+            </w:pPr>
+            <w:r>
+              <w:rPr>
+                <w:rFonts w:ascii="Times New Roman" w:hAnsi="Times New Roman"/>
+                <w:sz w:val="20"/>
+              </w:rPr>
+            </w:r>
+          </w:p>
+        </w:tc>
+        <w:tc>
+          <w:tcPr>
+            <w:tcW w:type="dxa" w:w="1728"/>
+            <w:vAlign w:val="center"/>
+            <w:tcBorders>
+              <w:top w:val="nil"/>
+              <w:left w:val="nil"/>
+              <w:bottom w:val="nil"/>
+              <w:right w:val="nil"/>
+              <w:insideH w:val="nil"/>
+              <w:insideV w:val="nil"/>
+            </w:tcBorders>
+          </w:tcPr>
+          <w:p>
+            <w:pPr>
+              <w:jc w:val="center"/>
+            </w:pPr>
+            <w:r>
+              <w:rPr>
+                <w:rFonts w:ascii="Times New Roman" w:hAnsi="Times New Roman"/>
+                <w:sz w:val="20"/>
+              </w:rPr>
+              <w:t>(0.007)</w:t>
+            </w:r>
+          </w:p>
+        </w:tc>
+        <w:tc>
+          <w:tcPr>
+            <w:tcW w:type="dxa" w:w="1728"/>
+            <w:vAlign w:val="center"/>
+            <w:tcBorders>
+              <w:top w:val="nil"/>
+              <w:left w:val="nil"/>
+              <w:bottom w:val="nil"/>
+              <w:right w:val="nil"/>
+              <w:insideH w:val="nil"/>
+              <w:insideV w:val="nil"/>
+            </w:tcBorders>
+          </w:tcPr>
+          <w:p>
+            <w:pPr>
+              <w:jc w:val="center"/>
+            </w:pPr>
+            <w:r>
+              <w:rPr>
+                <w:rFonts w:ascii="Times New Roman" w:hAnsi="Times New Roman"/>
+                <w:sz w:val="20"/>
+              </w:rPr>
+              <w:t>(0.007)</w:t>
+            </w:r>
+          </w:p>
+        </w:tc>
+        <w:tc>
+          <w:tcPr>
+            <w:tcW w:type="dxa" w:w="1728"/>
+            <w:vAlign w:val="center"/>
+            <w:tcBorders>
+              <w:top w:val="nil"/>
+              <w:left w:val="nil"/>
+              <w:bottom w:val="nil"/>
+              <w:right w:val="nil"/>
+              <w:insideH w:val="nil"/>
+              <w:insideV w:val="nil"/>
+            </w:tcBorders>
+          </w:tcPr>
+          <w:p>
+            <w:pPr>
+              <w:jc w:val="center"/>
+            </w:pPr>
+            <w:r>
+              <w:rPr>
+                <w:rFonts w:ascii="Times New Roman" w:hAnsi="Times New Roman"/>
+                <w:sz w:val="20"/>
+              </w:rPr>
+              <w:t>(0.007)</w:t>
+            </w:r>
+          </w:p>
+        </w:tc>
+      </w:tr>
+      <w:tr>
+        <w:tc>
+          <w:tcPr>
+            <w:tcW w:type="dxa" w:w="1728"/>
+            <w:vAlign w:val="center"/>
+            <w:tcBorders>
+              <w:top w:val="nil"/>
+              <w:left w:val="nil"/>
+              <w:bottom w:val="nil"/>
+              <w:right w:val="nil"/>
+              <w:insideH w:val="nil"/>
+              <w:insideV w:val="nil"/>
+            </w:tcBorders>
+          </w:tcPr>
+          <w:p>
+            <w:pPr>
+              <w:jc w:val="left"/>
+            </w:pPr>
+            <w:r>
+              <w:rPr>
+                <w:rFonts w:ascii="Times New Roman" w:hAnsi="Times New Roman"/>
+                <w:sz w:val="20"/>
+              </w:rPr>
+              <w:t>expersq</w:t>
+            </w:r>
+          </w:p>
+        </w:tc>
+        <w:tc>
+          <w:tcPr>
+            <w:tcW w:type="dxa" w:w="1728"/>
+            <w:vAlign w:val="center"/>
+            <w:tcBorders>
+              <w:top w:val="nil"/>
+              <w:left w:val="nil"/>
+              <w:bottom w:val="nil"/>
+              <w:right w:val="nil"/>
+              <w:insideH w:val="nil"/>
+              <w:insideV w:val="nil"/>
+            </w:tcBorders>
+          </w:tcPr>
+          <w:p>
+            <w:pPr>
+              <w:jc w:val="center"/>
+            </w:pPr>
+            <w:r>
+              <w:rPr>
+                <w:rFonts w:ascii="Times New Roman" w:hAnsi="Times New Roman"/>
+                <w:sz w:val="20"/>
+              </w:rPr>
+            </w:r>
+          </w:p>
+        </w:tc>
+        <w:tc>
+          <w:tcPr>
+            <w:tcW w:type="dxa" w:w="1728"/>
+            <w:vAlign w:val="center"/>
+            <w:tcBorders>
+              <w:top w:val="nil"/>
+              <w:left w:val="nil"/>
+              <w:bottom w:val="nil"/>
+              <w:right w:val="nil"/>
+              <w:insideH w:val="nil"/>
+              <w:insideV w:val="nil"/>
+            </w:tcBorders>
+          </w:tcPr>
+          <w:p>
+            <w:pPr>
+              <w:jc w:val="center"/>
+            </w:pPr>
+            <w:r>
+              <w:rPr>
+                <w:rFonts w:ascii="Times New Roman" w:hAnsi="Times New Roman"/>
+                <w:sz w:val="20"/>
+              </w:rPr>
+              <w:t>-0.002***</w:t>
+            </w:r>
+          </w:p>
+        </w:tc>
+        <w:tc>
+          <w:tcPr>
+            <w:tcW w:type="dxa" w:w="1728"/>
+            <w:vAlign w:val="center"/>
+            <w:tcBorders>
+              <w:top w:val="nil"/>
+              <w:left w:val="nil"/>
+              <w:bottom w:val="nil"/>
+              <w:right w:val="nil"/>
+              <w:insideH w:val="nil"/>
+              <w:insideV w:val="nil"/>
+            </w:tcBorders>
+          </w:tcPr>
+          <w:p>
+            <w:pPr>
+              <w:jc w:val="center"/>
+            </w:pPr>
+            <w:r>
+              <w:rPr>
+                <w:rFonts w:ascii="Times New Roman" w:hAnsi="Times New Roman"/>
+                <w:sz w:val="20"/>
+              </w:rPr>
+              <w:t>-0.002***</w:t>
+            </w:r>
+          </w:p>
+        </w:tc>
+        <w:tc>
+          <w:tcPr>
+            <w:tcW w:type="dxa" w:w="1728"/>
+            <w:vAlign w:val="center"/>
+            <w:tcBorders>
+              <w:top w:val="nil"/>
+              <w:left w:val="nil"/>
+              <w:bottom w:val="nil"/>
+              <w:right w:val="nil"/>
+              <w:insideH w:val="nil"/>
+              <w:insideV w:val="nil"/>
+            </w:tcBorders>
+          </w:tcPr>
+          <w:p>
+            <w:pPr>
+              <w:jc w:val="center"/>
+            </w:pPr>
+            <w:r>
+              <w:rPr>
+                <w:rFonts w:ascii="Times New Roman" w:hAnsi="Times New Roman"/>
+                <w:sz w:val="20"/>
+              </w:rPr>
+              <w:t>-0.002***</w:t>
+            </w:r>
+          </w:p>
+        </w:tc>
+      </w:tr>
+      <w:tr>
+        <w:tc>
+          <w:tcPr>
+            <w:tcW w:type="dxa" w:w="1728"/>
+            <w:vAlign w:val="center"/>
+            <w:tcBorders>
+              <w:top w:val="nil"/>
+              <w:left w:val="nil"/>
+              <w:bottom w:val="nil"/>
+              <w:right w:val="nil"/>
+              <w:insideH w:val="nil"/>
+              <w:insideV w:val="nil"/>
+            </w:tcBorders>
+          </w:tcPr>
+          <w:p>
+            <w:pPr>
+              <w:jc w:val="left"/>
+            </w:pPr>
+            <w:r>
+              <w:rPr>
+                <w:rFonts w:ascii="Times New Roman" w:hAnsi="Times New Roman"/>
+                <w:sz w:val="20"/>
+              </w:rPr>
+            </w:r>
+          </w:p>
+        </w:tc>
+        <w:tc>
+          <w:tcPr>
+            <w:tcW w:type="dxa" w:w="1728"/>
+            <w:vAlign w:val="center"/>
+            <w:tcBorders>
+              <w:top w:val="nil"/>
+              <w:left w:val="nil"/>
+              <w:bottom w:val="nil"/>
+              <w:right w:val="nil"/>
+              <w:insideH w:val="nil"/>
+              <w:insideV w:val="nil"/>
+            </w:tcBorders>
+          </w:tcPr>
+          <w:p>
+            <w:pPr>
+              <w:jc w:val="center"/>
+            </w:pPr>
+            <w:r>
+              <w:rPr>
+                <w:rFonts w:ascii="Times New Roman" w:hAnsi="Times New Roman"/>
+                <w:sz w:val="20"/>
+              </w:rPr>
+            </w:r>
+          </w:p>
+        </w:tc>
+        <w:tc>
+          <w:tcPr>
+            <w:tcW w:type="dxa" w:w="1728"/>
+            <w:vAlign w:val="center"/>
+            <w:tcBorders>
+              <w:top w:val="nil"/>
+              <w:left w:val="nil"/>
+              <w:bottom w:val="nil"/>
+              <w:right w:val="nil"/>
+              <w:insideH w:val="nil"/>
+              <w:insideV w:val="nil"/>
+            </w:tcBorders>
+          </w:tcPr>
+          <w:p>
+            <w:pPr>
+              <w:jc w:val="center"/>
+            </w:pPr>
+            <w:r>
+              <w:rPr>
+                <w:rFonts w:ascii="Times New Roman" w:hAnsi="Times New Roman"/>
+                <w:sz w:val="20"/>
+              </w:rPr>
+              <w:t>(0.000)</w:t>
+            </w:r>
+          </w:p>
+        </w:tc>
+        <w:tc>
+          <w:tcPr>
+            <w:tcW w:type="dxa" w:w="1728"/>
+            <w:vAlign w:val="center"/>
+            <w:tcBorders>
+              <w:top w:val="nil"/>
+              <w:left w:val="nil"/>
+              <w:bottom w:val="nil"/>
+              <w:right w:val="nil"/>
+              <w:insideH w:val="nil"/>
+              <w:insideV w:val="nil"/>
+            </w:tcBorders>
+          </w:tcPr>
+          <w:p>
+            <w:pPr>
+              <w:jc w:val="center"/>
+            </w:pPr>
+            <w:r>
+              <w:rPr>
+                <w:rFonts w:ascii="Times New Roman" w:hAnsi="Times New Roman"/>
+                <w:sz w:val="20"/>
+              </w:rPr>
+              <w:t>(0.000)</w:t>
+            </w:r>
+          </w:p>
+        </w:tc>
+        <w:tc>
+          <w:tcPr>
+            <w:tcW w:type="dxa" w:w="1728"/>
+            <w:vAlign w:val="center"/>
+            <w:tcBorders>
+              <w:top w:val="nil"/>
+              <w:left w:val="nil"/>
+              <w:bottom w:val="nil"/>
+              <w:right w:val="nil"/>
+              <w:insideH w:val="nil"/>
+              <w:insideV w:val="nil"/>
+            </w:tcBorders>
+          </w:tcPr>
+          <w:p>
+            <w:pPr>
+              <w:jc w:val="center"/>
+            </w:pPr>
+            <w:r>
+              <w:rPr>
+                <w:rFonts w:ascii="Times New Roman" w:hAnsi="Times New Roman"/>
+                <w:sz w:val="20"/>
+              </w:rPr>
+              <w:t>(0.000)</w:t>
+            </w:r>
+          </w:p>
+        </w:tc>
+      </w:tr>
+      <w:tr>
+        <w:tc>
+          <w:tcPr>
+            <w:tcW w:type="dxa" w:w="1728"/>
+            <w:vAlign w:val="center"/>
+            <w:tcBorders>
+              <w:top w:val="nil"/>
+              <w:left w:val="nil"/>
+              <w:bottom w:val="nil"/>
+              <w:right w:val="nil"/>
+              <w:insideH w:val="nil"/>
+              <w:insideV w:val="nil"/>
+            </w:tcBorders>
+          </w:tcPr>
+          <w:p>
+            <w:pPr>
+              <w:jc w:val="left"/>
+            </w:pPr>
+            <w:r>
+              <w:rPr>
+                <w:rFonts w:ascii="Times New Roman" w:hAnsi="Times New Roman"/>
+                <w:sz w:val="20"/>
+              </w:rPr>
+              <w:t>black</w:t>
+            </w:r>
+          </w:p>
+        </w:tc>
+        <w:tc>
+          <w:tcPr>
+            <w:tcW w:type="dxa" w:w="1728"/>
+            <w:vAlign w:val="center"/>
+            <w:tcBorders>
+              <w:top w:val="nil"/>
+              <w:left w:val="nil"/>
+              <w:bottom w:val="nil"/>
+              <w:right w:val="nil"/>
+              <w:insideH w:val="nil"/>
+              <w:insideV w:val="nil"/>
+            </w:tcBorders>
+          </w:tcPr>
+          <w:p>
+            <w:pPr>
+              <w:jc w:val="center"/>
+            </w:pPr>
+            <w:r>
+              <w:rPr>
+                <w:rFonts w:ascii="Times New Roman" w:hAnsi="Times New Roman"/>
+                <w:sz w:val="20"/>
+              </w:rPr>
+            </w:r>
+          </w:p>
+        </w:tc>
+        <w:tc>
+          <w:tcPr>
+            <w:tcW w:type="dxa" w:w="1728"/>
+            <w:vAlign w:val="center"/>
+            <w:tcBorders>
+              <w:top w:val="nil"/>
+              <w:left w:val="nil"/>
+              <w:bottom w:val="nil"/>
+              <w:right w:val="nil"/>
+              <w:insideH w:val="nil"/>
+              <w:insideV w:val="nil"/>
+            </w:tcBorders>
+          </w:tcPr>
+          <w:p>
+            <w:pPr>
+              <w:jc w:val="center"/>
+            </w:pPr>
+            <w:r>
+              <w:rPr>
+                <w:rFonts w:ascii="Times New Roman" w:hAnsi="Times New Roman"/>
+                <w:sz w:val="20"/>
+              </w:rPr>
+            </w:r>
+          </w:p>
+        </w:tc>
+        <w:tc>
+          <w:tcPr>
+            <w:tcW w:type="dxa" w:w="1728"/>
+            <w:vAlign w:val="center"/>
+            <w:tcBorders>
+              <w:top w:val="nil"/>
+              <w:left w:val="nil"/>
+              <w:bottom w:val="nil"/>
+              <w:right w:val="nil"/>
+              <w:insideH w:val="nil"/>
+              <w:insideV w:val="nil"/>
+            </w:tcBorders>
+          </w:tcPr>
+          <w:p>
+            <w:pPr>
+              <w:jc w:val="center"/>
+            </w:pPr>
+            <w:r>
+              <w:rPr>
+                <w:rFonts w:ascii="Times New Roman" w:hAnsi="Times New Roman"/>
+                <w:sz w:val="20"/>
+              </w:rPr>
+              <w:t>-0.190***</w:t>
+            </w:r>
+          </w:p>
+        </w:tc>
+        <w:tc>
+          <w:tcPr>
+            <w:tcW w:type="dxa" w:w="1728"/>
+            <w:vAlign w:val="center"/>
+            <w:tcBorders>
+              <w:top w:val="nil"/>
+              <w:left w:val="nil"/>
+              <w:bottom w:val="nil"/>
+              <w:right w:val="nil"/>
+              <w:insideH w:val="nil"/>
+              <w:insideV w:val="nil"/>
+            </w:tcBorders>
+          </w:tcPr>
+          <w:p>
+            <w:pPr>
+              <w:jc w:val="center"/>
+            </w:pPr>
+            <w:r>
+              <w:rPr>
+                <w:rFonts w:ascii="Times New Roman" w:hAnsi="Times New Roman"/>
+                <w:sz w:val="20"/>
+              </w:rPr>
+              <w:t>-0.199***</w:t>
+            </w:r>
+          </w:p>
+        </w:tc>
+      </w:tr>
+      <w:tr>
+        <w:tc>
+          <w:tcPr>
+            <w:tcW w:type="dxa" w:w="1728"/>
+            <w:vAlign w:val="center"/>
+            <w:tcBorders>
+              <w:top w:val="nil"/>
+              <w:left w:val="nil"/>
+              <w:bottom w:val="nil"/>
+              <w:right w:val="nil"/>
+              <w:insideH w:val="nil"/>
+              <w:insideV w:val="nil"/>
+            </w:tcBorders>
+          </w:tcPr>
+          <w:p>
+            <w:pPr>
+              <w:jc w:val="left"/>
+            </w:pPr>
+            <w:r>
+              <w:rPr>
+                <w:rFonts w:ascii="Times New Roman" w:hAnsi="Times New Roman"/>
+                <w:sz w:val="20"/>
+              </w:rPr>
+            </w:r>
+          </w:p>
+        </w:tc>
+        <w:tc>
+          <w:tcPr>
+            <w:tcW w:type="dxa" w:w="1728"/>
+            <w:vAlign w:val="center"/>
+            <w:tcBorders>
+              <w:top w:val="nil"/>
+              <w:left w:val="nil"/>
+              <w:bottom w:val="nil"/>
+              <w:right w:val="nil"/>
+              <w:insideH w:val="nil"/>
+              <w:insideV w:val="nil"/>
+            </w:tcBorders>
+          </w:tcPr>
+          <w:p>
+            <w:pPr>
+              <w:jc w:val="center"/>
+            </w:pPr>
+            <w:r>
+              <w:rPr>
+                <w:rFonts w:ascii="Times New Roman" w:hAnsi="Times New Roman"/>
+                <w:sz w:val="20"/>
+              </w:rPr>
+            </w:r>
+          </w:p>
+        </w:tc>
+        <w:tc>
+          <w:tcPr>
+            <w:tcW w:type="dxa" w:w="1728"/>
+            <w:vAlign w:val="center"/>
+            <w:tcBorders>
+              <w:top w:val="nil"/>
+              <w:left w:val="nil"/>
+              <w:bottom w:val="nil"/>
+              <w:right w:val="nil"/>
+              <w:insideH w:val="nil"/>
+              <w:insideV w:val="nil"/>
+            </w:tcBorders>
+          </w:tcPr>
+          <w:p>
+            <w:pPr>
+              <w:jc w:val="center"/>
+            </w:pPr>
+            <w:r>
+              <w:rPr>
+                <w:rFonts w:ascii="Times New Roman" w:hAnsi="Times New Roman"/>
+                <w:sz w:val="20"/>
+              </w:rPr>
+            </w:r>
+          </w:p>
+        </w:tc>
+        <w:tc>
+          <w:tcPr>
+            <w:tcW w:type="dxa" w:w="1728"/>
+            <w:vAlign w:val="center"/>
+            <w:tcBorders>
+              <w:top w:val="nil"/>
+              <w:left w:val="nil"/>
+              <w:bottom w:val="nil"/>
+              <w:right w:val="nil"/>
+              <w:insideH w:val="nil"/>
+              <w:insideV w:val="nil"/>
+            </w:tcBorders>
+          </w:tcPr>
+          <w:p>
+            <w:pPr>
+              <w:jc w:val="center"/>
+            </w:pPr>
+            <w:r>
+              <w:rPr>
+                <w:rFonts w:ascii="Times New Roman" w:hAnsi="Times New Roman"/>
+                <w:sz w:val="20"/>
+              </w:rPr>
+              <w:t>(0.017)</w:t>
+            </w:r>
+          </w:p>
+        </w:tc>
+        <w:tc>
+          <w:tcPr>
+            <w:tcW w:type="dxa" w:w="1728"/>
+            <w:vAlign w:val="center"/>
+            <w:tcBorders>
+              <w:top w:val="nil"/>
+              <w:left w:val="nil"/>
+              <w:bottom w:val="nil"/>
+              <w:right w:val="nil"/>
+              <w:insideH w:val="nil"/>
+              <w:insideV w:val="nil"/>
+            </w:tcBorders>
+          </w:tcPr>
+          <w:p>
+            <w:pPr>
+              <w:jc w:val="center"/>
+            </w:pPr>
+            <w:r>
+              <w:rPr>
+                <w:rFonts w:ascii="Times New Roman" w:hAnsi="Times New Roman"/>
+                <w:sz w:val="20"/>
+              </w:rPr>
+              <w:t>(0.018)</w:t>
+            </w:r>
+          </w:p>
+        </w:tc>
+      </w:tr>
+      <w:tr>
+        <w:tc>
+          <w:tcPr>
+            <w:tcW w:type="dxa" w:w="1728"/>
+            <w:vAlign w:val="center"/>
+            <w:tcBorders>
+              <w:top w:val="nil"/>
+              <w:left w:val="nil"/>
+              <w:bottom w:val="nil"/>
+              <w:right w:val="nil"/>
+              <w:insideH w:val="nil"/>
+              <w:insideV w:val="nil"/>
+            </w:tcBorders>
+          </w:tcPr>
+          <w:p>
+            <w:pPr>
+              <w:jc w:val="left"/>
+            </w:pPr>
+            <w:r>
+              <w:rPr>
+                <w:rFonts w:ascii="Times New Roman" w:hAnsi="Times New Roman"/>
+                <w:sz w:val="20"/>
+              </w:rPr>
+              <w:t>south</w:t>
+            </w:r>
+          </w:p>
+        </w:tc>
+        <w:tc>
+          <w:tcPr>
+            <w:tcW w:type="dxa" w:w="1728"/>
+            <w:vAlign w:val="center"/>
+            <w:tcBorders>
+              <w:top w:val="nil"/>
+              <w:left w:val="nil"/>
+              <w:bottom w:val="nil"/>
+              <w:right w:val="nil"/>
+              <w:insideH w:val="nil"/>
+              <w:insideV w:val="nil"/>
+            </w:tcBorders>
+          </w:tcPr>
+          <w:p>
+            <w:pPr>
+              <w:jc w:val="center"/>
+            </w:pPr>
+            <w:r>
+              <w:rPr>
+                <w:rFonts w:ascii="Times New Roman" w:hAnsi="Times New Roman"/>
+                <w:sz w:val="20"/>
+              </w:rPr>
+            </w:r>
+          </w:p>
+        </w:tc>
+        <w:tc>
+          <w:tcPr>
+            <w:tcW w:type="dxa" w:w="1728"/>
+            <w:vAlign w:val="center"/>
+            <w:tcBorders>
+              <w:top w:val="nil"/>
+              <w:left w:val="nil"/>
+              <w:bottom w:val="nil"/>
+              <w:right w:val="nil"/>
+              <w:insideH w:val="nil"/>
+              <w:insideV w:val="nil"/>
+            </w:tcBorders>
+          </w:tcPr>
+          <w:p>
+            <w:pPr>
+              <w:jc w:val="center"/>
+            </w:pPr>
+            <w:r>
+              <w:rPr>
+                <w:rFonts w:ascii="Times New Roman" w:hAnsi="Times New Roman"/>
+                <w:sz w:val="20"/>
+              </w:rPr>
+            </w:r>
+          </w:p>
+        </w:tc>
+        <w:tc>
+          <w:tcPr>
+            <w:tcW w:type="dxa" w:w="1728"/>
+            <w:vAlign w:val="center"/>
+            <w:tcBorders>
+              <w:top w:val="nil"/>
+              <w:left w:val="nil"/>
+              <w:bottom w:val="nil"/>
+              <w:right w:val="nil"/>
+              <w:insideH w:val="nil"/>
+              <w:insideV w:val="nil"/>
+            </w:tcBorders>
+          </w:tcPr>
+          <w:p>
+            <w:pPr>
+              <w:jc w:val="center"/>
+            </w:pPr>
+            <w:r>
+              <w:rPr>
+                <w:rFonts w:ascii="Times New Roman" w:hAnsi="Times New Roman"/>
+                <w:sz w:val="20"/>
+              </w:rPr>
+              <w:t>-0.125***</w:t>
+            </w:r>
+          </w:p>
+        </w:tc>
+        <w:tc>
+          <w:tcPr>
+            <w:tcW w:type="dxa" w:w="1728"/>
+            <w:vAlign w:val="center"/>
+            <w:tcBorders>
+              <w:top w:val="nil"/>
+              <w:left w:val="nil"/>
+              <w:bottom w:val="nil"/>
+              <w:right w:val="nil"/>
+              <w:insideH w:val="nil"/>
+              <w:insideV w:val="nil"/>
+            </w:tcBorders>
+          </w:tcPr>
+          <w:p>
+            <w:pPr>
+              <w:jc w:val="center"/>
+            </w:pPr>
+            <w:r>
+              <w:rPr>
+                <w:rFonts w:ascii="Times New Roman" w:hAnsi="Times New Roman"/>
+                <w:sz w:val="20"/>
+              </w:rPr>
+              <w:t>-0.148***</w:t>
+            </w:r>
+          </w:p>
+        </w:tc>
+      </w:tr>
+      <w:tr>
+        <w:tc>
+          <w:tcPr>
+            <w:tcW w:type="dxa" w:w="1728"/>
+            <w:vAlign w:val="center"/>
+            <w:tcBorders>
+              <w:top w:val="nil"/>
+              <w:left w:val="nil"/>
+              <w:bottom w:val="nil"/>
+              <w:right w:val="nil"/>
+              <w:insideH w:val="nil"/>
+              <w:insideV w:val="nil"/>
+            </w:tcBorders>
+          </w:tcPr>
+          <w:p>
+            <w:pPr>
+              <w:jc w:val="left"/>
+            </w:pPr>
+            <w:r>
+              <w:rPr>
+                <w:rFonts w:ascii="Times New Roman" w:hAnsi="Times New Roman"/>
+                <w:sz w:val="20"/>
+              </w:rPr>
+            </w:r>
+          </w:p>
+        </w:tc>
+        <w:tc>
+          <w:tcPr>
+            <w:tcW w:type="dxa" w:w="1728"/>
+            <w:vAlign w:val="center"/>
+            <w:tcBorders>
+              <w:top w:val="nil"/>
+              <w:left w:val="nil"/>
+              <w:bottom w:val="nil"/>
+              <w:right w:val="nil"/>
+              <w:insideH w:val="nil"/>
+              <w:insideV w:val="nil"/>
+            </w:tcBorders>
+          </w:tcPr>
+          <w:p>
+            <w:pPr>
+              <w:jc w:val="center"/>
+            </w:pPr>
+            <w:r>
+              <w:rPr>
+                <w:rFonts w:ascii="Times New Roman" w:hAnsi="Times New Roman"/>
+                <w:sz w:val="20"/>
+              </w:rPr>
+            </w:r>
+          </w:p>
+        </w:tc>
+        <w:tc>
+          <w:tcPr>
+            <w:tcW w:type="dxa" w:w="1728"/>
+            <w:vAlign w:val="center"/>
+            <w:tcBorders>
+              <w:top w:val="nil"/>
+              <w:left w:val="nil"/>
+              <w:bottom w:val="nil"/>
+              <w:right w:val="nil"/>
+              <w:insideH w:val="nil"/>
+              <w:insideV w:val="nil"/>
+            </w:tcBorders>
+          </w:tcPr>
+          <w:p>
+            <w:pPr>
+              <w:jc w:val="center"/>
+            </w:pPr>
+            <w:r>
+              <w:rPr>
+                <w:rFonts w:ascii="Times New Roman" w:hAnsi="Times New Roman"/>
+                <w:sz w:val="20"/>
+              </w:rPr>
+            </w:r>
+          </w:p>
+        </w:tc>
+        <w:tc>
+          <w:tcPr>
+            <w:tcW w:type="dxa" w:w="1728"/>
+            <w:vAlign w:val="center"/>
+            <w:tcBorders>
+              <w:top w:val="nil"/>
+              <w:left w:val="nil"/>
+              <w:bottom w:val="nil"/>
+              <w:right w:val="nil"/>
+              <w:insideH w:val="nil"/>
+              <w:insideV w:val="nil"/>
+            </w:tcBorders>
+          </w:tcPr>
+          <w:p>
+            <w:pPr>
+              <w:jc w:val="center"/>
+            </w:pPr>
+            <w:r>
+              <w:rPr>
+                <w:rFonts w:ascii="Times New Roman" w:hAnsi="Times New Roman"/>
+                <w:sz w:val="20"/>
+              </w:rPr>
+              <w:t>(0.015)</w:t>
+            </w:r>
+          </w:p>
+        </w:tc>
+        <w:tc>
+          <w:tcPr>
+            <w:tcW w:type="dxa" w:w="1728"/>
+            <w:vAlign w:val="center"/>
+            <w:tcBorders>
+              <w:top w:val="nil"/>
+              <w:left w:val="nil"/>
+              <w:bottom w:val="nil"/>
+              <w:right w:val="nil"/>
+              <w:insideH w:val="nil"/>
+              <w:insideV w:val="nil"/>
+            </w:tcBorders>
+          </w:tcPr>
+          <w:p>
+            <w:pPr>
+              <w:jc w:val="center"/>
+            </w:pPr>
+            <w:r>
+              <w:rPr>
+                <w:rFonts w:ascii="Times New Roman" w:hAnsi="Times New Roman"/>
+                <w:sz w:val="20"/>
+              </w:rPr>
+              <w:t>(0.028)</w:t>
+            </w:r>
+          </w:p>
+        </w:tc>
+      </w:tr>
+      <w:tr>
+        <w:tc>
+          <w:tcPr>
+            <w:tcW w:type="dxa" w:w="1728"/>
+            <w:vAlign w:val="center"/>
+            <w:tcBorders>
+              <w:top w:val="nil"/>
+              <w:left w:val="nil"/>
+              <w:bottom w:val="nil"/>
+              <w:right w:val="nil"/>
+              <w:insideH w:val="nil"/>
+              <w:insideV w:val="nil"/>
+            </w:tcBorders>
+          </w:tcPr>
+          <w:p>
+            <w:pPr>
+              <w:jc w:val="left"/>
+            </w:pPr>
+            <w:r>
+              <w:rPr>
+                <w:rFonts w:ascii="Times New Roman" w:hAnsi="Times New Roman"/>
+                <w:sz w:val="20"/>
+              </w:rPr>
+              <w:t>smsa</w:t>
+            </w:r>
+          </w:p>
+        </w:tc>
+        <w:tc>
+          <w:tcPr>
+            <w:tcW w:type="dxa" w:w="1728"/>
+            <w:vAlign w:val="center"/>
+            <w:tcBorders>
+              <w:top w:val="nil"/>
+              <w:left w:val="nil"/>
+              <w:bottom w:val="nil"/>
+              <w:right w:val="nil"/>
+              <w:insideH w:val="nil"/>
+              <w:insideV w:val="nil"/>
+            </w:tcBorders>
+          </w:tcPr>
+          <w:p>
+            <w:pPr>
+              <w:jc w:val="center"/>
+            </w:pPr>
+            <w:r>
+              <w:rPr>
+                <w:rFonts w:ascii="Times New Roman" w:hAnsi="Times New Roman"/>
+                <w:sz w:val="20"/>
+              </w:rPr>
+            </w:r>
+          </w:p>
+        </w:tc>
+        <w:tc>
+          <w:tcPr>
+            <w:tcW w:type="dxa" w:w="1728"/>
+            <w:vAlign w:val="center"/>
+            <w:tcBorders>
+              <w:top w:val="nil"/>
+              <w:left w:val="nil"/>
+              <w:bottom w:val="nil"/>
+              <w:right w:val="nil"/>
+              <w:insideH w:val="nil"/>
+              <w:insideV w:val="nil"/>
+            </w:tcBorders>
+          </w:tcPr>
+          <w:p>
+            <w:pPr>
+              <w:jc w:val="center"/>
+            </w:pPr>
+            <w:r>
+              <w:rPr>
+                <w:rFonts w:ascii="Times New Roman" w:hAnsi="Times New Roman"/>
+                <w:sz w:val="20"/>
+              </w:rPr>
+            </w:r>
+          </w:p>
+        </w:tc>
+        <w:tc>
+          <w:tcPr>
+            <w:tcW w:type="dxa" w:w="1728"/>
+            <w:vAlign w:val="center"/>
+            <w:tcBorders>
+              <w:top w:val="nil"/>
+              <w:left w:val="nil"/>
+              <w:bottom w:val="nil"/>
+              <w:right w:val="nil"/>
+              <w:insideH w:val="nil"/>
+              <w:insideV w:val="nil"/>
+            </w:tcBorders>
+          </w:tcPr>
+          <w:p>
+            <w:pPr>
+              <w:jc w:val="center"/>
+            </w:pPr>
+            <w:r>
+              <w:rPr>
+                <w:rFonts w:ascii="Times New Roman" w:hAnsi="Times New Roman"/>
+                <w:sz w:val="20"/>
+              </w:rPr>
+              <w:t>0.161***</w:t>
+            </w:r>
+          </w:p>
+        </w:tc>
+        <w:tc>
+          <w:tcPr>
+            <w:tcW w:type="dxa" w:w="1728"/>
+            <w:vAlign w:val="center"/>
+            <w:tcBorders>
+              <w:top w:val="nil"/>
+              <w:left w:val="nil"/>
+              <w:bottom w:val="nil"/>
+              <w:right w:val="nil"/>
+              <w:insideH w:val="nil"/>
+              <w:insideV w:val="nil"/>
+            </w:tcBorders>
+          </w:tcPr>
+          <w:p>
+            <w:pPr>
+              <w:jc w:val="center"/>
+            </w:pPr>
+            <w:r>
+              <w:rPr>
+                <w:rFonts w:ascii="Times New Roman" w:hAnsi="Times New Roman"/>
+                <w:sz w:val="20"/>
+              </w:rPr>
+              <w:t>0.136***</w:t>
+            </w:r>
+          </w:p>
+        </w:tc>
+      </w:tr>
+      <w:tr>
+        <w:tc>
+          <w:tcPr>
+            <w:tcW w:type="dxa" w:w="1728"/>
+            <w:vAlign w:val="center"/>
+            <w:tcBorders>
+              <w:top w:val="nil"/>
+              <w:left w:val="nil"/>
+              <w:bottom w:val="nil"/>
+              <w:right w:val="nil"/>
+              <w:insideH w:val="nil"/>
+              <w:insideV w:val="nil"/>
+            </w:tcBorders>
+          </w:tcPr>
+          <w:p>
+            <w:pPr>
+              <w:jc w:val="left"/>
+            </w:pPr>
+            <w:r>
+              <w:rPr>
+                <w:rFonts w:ascii="Times New Roman" w:hAnsi="Times New Roman"/>
+                <w:sz w:val="20"/>
+              </w:rPr>
+            </w:r>
+          </w:p>
+        </w:tc>
+        <w:tc>
+          <w:tcPr>
+            <w:tcW w:type="dxa" w:w="1728"/>
+            <w:vAlign w:val="center"/>
+            <w:tcBorders>
+              <w:top w:val="nil"/>
+              <w:left w:val="nil"/>
+              <w:bottom w:val="nil"/>
+              <w:right w:val="nil"/>
+              <w:insideH w:val="nil"/>
+              <w:insideV w:val="nil"/>
+            </w:tcBorders>
+          </w:tcPr>
+          <w:p>
+            <w:pPr>
+              <w:jc w:val="center"/>
+            </w:pPr>
+            <w:r>
+              <w:rPr>
+                <w:rFonts w:ascii="Times New Roman" w:hAnsi="Times New Roman"/>
+                <w:sz w:val="20"/>
+              </w:rPr>
+            </w:r>
+          </w:p>
+        </w:tc>
+        <w:tc>
+          <w:tcPr>
+            <w:tcW w:type="dxa" w:w="1728"/>
+            <w:vAlign w:val="center"/>
+            <w:tcBorders>
+              <w:top w:val="nil"/>
+              <w:left w:val="nil"/>
+              <w:bottom w:val="nil"/>
+              <w:right w:val="nil"/>
+              <w:insideH w:val="nil"/>
+              <w:insideV w:val="nil"/>
+            </w:tcBorders>
+          </w:tcPr>
+          <w:p>
+            <w:pPr>
+              <w:jc w:val="center"/>
+            </w:pPr>
+            <w:r>
+              <w:rPr>
+                <w:rFonts w:ascii="Times New Roman" w:hAnsi="Times New Roman"/>
+                <w:sz w:val="20"/>
+              </w:rPr>
+            </w:r>
+          </w:p>
+        </w:tc>
+        <w:tc>
+          <w:tcPr>
+            <w:tcW w:type="dxa" w:w="1728"/>
+            <w:vAlign w:val="center"/>
+            <w:tcBorders>
+              <w:top w:val="nil"/>
+              <w:left w:val="nil"/>
+              <w:bottom w:val="nil"/>
+              <w:right w:val="nil"/>
+              <w:insideH w:val="nil"/>
+              <w:insideV w:val="nil"/>
+            </w:tcBorders>
+          </w:tcPr>
+          <w:p>
+            <w:pPr>
+              <w:jc w:val="center"/>
+            </w:pPr>
+            <w:r>
+              <w:rPr>
+                <w:rFonts w:ascii="Times New Roman" w:hAnsi="Times New Roman"/>
+                <w:sz w:val="20"/>
+              </w:rPr>
+              <w:t>(0.015)</w:t>
+            </w:r>
+          </w:p>
+        </w:tc>
+        <w:tc>
+          <w:tcPr>
+            <w:tcW w:type="dxa" w:w="1728"/>
+            <w:vAlign w:val="center"/>
+            <w:tcBorders>
+              <w:top w:val="nil"/>
+              <w:left w:val="nil"/>
+              <w:bottom w:val="nil"/>
+              <w:right w:val="nil"/>
+              <w:insideH w:val="nil"/>
+              <w:insideV w:val="nil"/>
+            </w:tcBorders>
+          </w:tcPr>
+          <w:p>
+            <w:pPr>
+              <w:jc w:val="center"/>
+            </w:pPr>
+            <w:r>
+              <w:rPr>
+                <w:rFonts w:ascii="Times New Roman" w:hAnsi="Times New Roman"/>
+                <w:sz w:val="20"/>
+              </w:rPr>
+              <w:t>(0.019)</w:t>
+            </w:r>
+          </w:p>
+        </w:tc>
+      </w:tr>
+      <w:tr>
+        <w:tc>
+          <w:tcPr>
+            <w:tcW w:type="dxa" w:w="1728"/>
+            <w:vAlign w:val="center"/>
+            <w:tcBorders>
+              <w:top w:val="nil"/>
+              <w:left w:val="nil"/>
+              <w:bottom w:val="nil"/>
+              <w:right w:val="nil"/>
+              <w:insideH w:val="nil"/>
+              <w:insideV w:val="nil"/>
+            </w:tcBorders>
+          </w:tcPr>
+          <w:p>
+            <w:pPr>
+              <w:jc w:val="left"/>
+            </w:pPr>
+            <w:r>
+              <w:rPr>
+                <w:rFonts w:ascii="Times New Roman" w:hAnsi="Times New Roman"/>
+                <w:sz w:val="20"/>
+              </w:rPr>
+              <w:t>smsa66</w:t>
+            </w:r>
+          </w:p>
+        </w:tc>
+        <w:tc>
+          <w:tcPr>
+            <w:tcW w:type="dxa" w:w="1728"/>
+            <w:vAlign w:val="center"/>
+            <w:tcBorders>
+              <w:top w:val="nil"/>
+              <w:left w:val="nil"/>
+              <w:bottom w:val="nil"/>
+              <w:right w:val="nil"/>
+              <w:insideH w:val="nil"/>
+              <w:insideV w:val="nil"/>
+            </w:tcBorders>
+          </w:tcPr>
+          <w:p>
+            <w:pPr>
+              <w:jc w:val="center"/>
+            </w:pPr>
+            <w:r>
+              <w:rPr>
+                <w:rFonts w:ascii="Times New Roman" w:hAnsi="Times New Roman"/>
+                <w:sz w:val="20"/>
+              </w:rPr>
+            </w:r>
+          </w:p>
+        </w:tc>
+        <w:tc>
+          <w:tcPr>
+            <w:tcW w:type="dxa" w:w="1728"/>
+            <w:vAlign w:val="center"/>
+            <w:tcBorders>
+              <w:top w:val="nil"/>
+              <w:left w:val="nil"/>
+              <w:bottom w:val="nil"/>
+              <w:right w:val="nil"/>
+              <w:insideH w:val="nil"/>
+              <w:insideV w:val="nil"/>
+            </w:tcBorders>
+          </w:tcPr>
+          <w:p>
+            <w:pPr>
+              <w:jc w:val="center"/>
+            </w:pPr>
+            <w:r>
+              <w:rPr>
+                <w:rFonts w:ascii="Times New Roman" w:hAnsi="Times New Roman"/>
+                <w:sz w:val="20"/>
+              </w:rPr>
+            </w:r>
+          </w:p>
+        </w:tc>
+        <w:tc>
+          <w:tcPr>
+            <w:tcW w:type="dxa" w:w="1728"/>
+            <w:vAlign w:val="center"/>
+            <w:tcBorders>
+              <w:top w:val="nil"/>
+              <w:left w:val="nil"/>
+              <w:bottom w:val="nil"/>
+              <w:right w:val="nil"/>
+              <w:insideH w:val="nil"/>
+              <w:insideV w:val="nil"/>
+            </w:tcBorders>
+          </w:tcPr>
+          <w:p>
+            <w:pPr>
+              <w:jc w:val="center"/>
+            </w:pPr>
+            <w:r>
+              <w:rPr>
+                <w:rFonts w:ascii="Times New Roman" w:hAnsi="Times New Roman"/>
+                <w:sz w:val="20"/>
+              </w:rPr>
+            </w:r>
+          </w:p>
+        </w:tc>
+        <w:tc>
+          <w:tcPr>
+            <w:tcW w:type="dxa" w:w="1728"/>
+            <w:vAlign w:val="center"/>
+            <w:tcBorders>
+              <w:top w:val="nil"/>
+              <w:left w:val="nil"/>
+              <w:bottom w:val="nil"/>
+              <w:right w:val="nil"/>
+              <w:insideH w:val="nil"/>
+              <w:insideV w:val="nil"/>
+            </w:tcBorders>
+          </w:tcPr>
+          <w:p>
+            <w:pPr>
+              <w:jc w:val="center"/>
+            </w:pPr>
+            <w:r>
+              <w:rPr>
+                <w:rFonts w:ascii="Times New Roman" w:hAnsi="Times New Roman"/>
+                <w:sz w:val="20"/>
+              </w:rPr>
+              <w:t>0.026</w:t>
+            </w:r>
+          </w:p>
+        </w:tc>
+      </w:tr>
+      <w:tr>
+        <w:tc>
+          <w:tcPr>
+            <w:tcW w:type="dxa" w:w="1728"/>
+            <w:vAlign w:val="center"/>
+            <w:tcBorders>
+              <w:top w:val="nil"/>
+              <w:left w:val="nil"/>
+              <w:bottom w:val="nil"/>
+              <w:right w:val="nil"/>
+              <w:insideH w:val="nil"/>
+              <w:insideV w:val="nil"/>
+            </w:tcBorders>
+          </w:tcPr>
+          <w:p>
+            <w:pPr>
+              <w:jc w:val="left"/>
+            </w:pPr>
+            <w:r>
+              <w:rPr>
+                <w:rFonts w:ascii="Times New Roman" w:hAnsi="Times New Roman"/>
+                <w:sz w:val="20"/>
+              </w:rPr>
+            </w:r>
+          </w:p>
+        </w:tc>
+        <w:tc>
+          <w:tcPr>
+            <w:tcW w:type="dxa" w:w="1728"/>
+            <w:vAlign w:val="center"/>
+            <w:tcBorders>
+              <w:top w:val="nil"/>
+              <w:left w:val="nil"/>
+              <w:bottom w:val="nil"/>
+              <w:right w:val="nil"/>
+              <w:insideH w:val="nil"/>
+              <w:insideV w:val="nil"/>
+            </w:tcBorders>
+          </w:tcPr>
+          <w:p>
+            <w:pPr>
+              <w:jc w:val="center"/>
+            </w:pPr>
+            <w:r>
+              <w:rPr>
+                <w:rFonts w:ascii="Times New Roman" w:hAnsi="Times New Roman"/>
+                <w:sz w:val="20"/>
+              </w:rPr>
+            </w:r>
+          </w:p>
+        </w:tc>
+        <w:tc>
+          <w:tcPr>
+            <w:tcW w:type="dxa" w:w="1728"/>
+            <w:vAlign w:val="center"/>
+            <w:tcBorders>
+              <w:top w:val="nil"/>
+              <w:left w:val="nil"/>
+              <w:bottom w:val="nil"/>
+              <w:right w:val="nil"/>
+              <w:insideH w:val="nil"/>
+              <w:insideV w:val="nil"/>
+            </w:tcBorders>
+          </w:tcPr>
+          <w:p>
+            <w:pPr>
+              <w:jc w:val="center"/>
+            </w:pPr>
+            <w:r>
+              <w:rPr>
+                <w:rFonts w:ascii="Times New Roman" w:hAnsi="Times New Roman"/>
+                <w:sz w:val="20"/>
+              </w:rPr>
+            </w:r>
+          </w:p>
+        </w:tc>
+        <w:tc>
+          <w:tcPr>
+            <w:tcW w:type="dxa" w:w="1728"/>
+            <w:vAlign w:val="center"/>
+            <w:tcBorders>
+              <w:top w:val="nil"/>
+              <w:left w:val="nil"/>
+              <w:bottom w:val="nil"/>
+              <w:right w:val="nil"/>
+              <w:insideH w:val="nil"/>
+              <w:insideV w:val="nil"/>
+            </w:tcBorders>
+          </w:tcPr>
+          <w:p>
+            <w:pPr>
+              <w:jc w:val="center"/>
+            </w:pPr>
+            <w:r>
+              <w:rPr>
+                <w:rFonts w:ascii="Times New Roman" w:hAnsi="Times New Roman"/>
+                <w:sz w:val="20"/>
+              </w:rPr>
+            </w:r>
+          </w:p>
+        </w:tc>
+        <w:tc>
+          <w:tcPr>
+            <w:tcW w:type="dxa" w:w="1728"/>
+            <w:vAlign w:val="center"/>
+            <w:tcBorders>
+              <w:top w:val="nil"/>
+              <w:left w:val="nil"/>
+              <w:bottom w:val="nil"/>
+              <w:right w:val="nil"/>
+              <w:insideH w:val="nil"/>
+              <w:insideV w:val="nil"/>
+            </w:tcBorders>
+          </w:tcPr>
+          <w:p>
+            <w:pPr>
+              <w:jc w:val="center"/>
+            </w:pPr>
+            <w:r>
+              <w:rPr>
+                <w:rFonts w:ascii="Times New Roman" w:hAnsi="Times New Roman"/>
+                <w:sz w:val="20"/>
+              </w:rPr>
+              <w:t>(0.019)</w:t>
+            </w:r>
+          </w:p>
+        </w:tc>
+      </w:tr>
+      <w:tr>
+        <w:tc>
+          <w:tcPr>
+            <w:tcW w:type="dxa" w:w="1728"/>
+            <w:vAlign w:val="center"/>
+            <w:tcBorders>
+              <w:top w:val="nil"/>
+              <w:left w:val="nil"/>
+              <w:bottom w:val="nil"/>
+              <w:right w:val="nil"/>
+              <w:insideH w:val="nil"/>
+              <w:insideV w:val="nil"/>
+            </w:tcBorders>
+          </w:tcPr>
+          <w:p>
+            <w:pPr>
+              <w:jc w:val="left"/>
+            </w:pPr>
+            <w:r>
+              <w:rPr>
+                <w:rFonts w:ascii="Times New Roman" w:hAnsi="Times New Roman"/>
+                <w:sz w:val="20"/>
+              </w:rPr>
+              <w:t>reg662</w:t>
+            </w:r>
+          </w:p>
+        </w:tc>
+        <w:tc>
+          <w:tcPr>
+            <w:tcW w:type="dxa" w:w="1728"/>
+            <w:vAlign w:val="center"/>
+            <w:tcBorders>
+              <w:top w:val="nil"/>
+              <w:left w:val="nil"/>
+              <w:bottom w:val="nil"/>
+              <w:right w:val="nil"/>
+              <w:insideH w:val="nil"/>
+              <w:insideV w:val="nil"/>
+            </w:tcBorders>
+          </w:tcPr>
+          <w:p>
+            <w:pPr>
+              <w:jc w:val="center"/>
+            </w:pPr>
+            <w:r>
+              <w:rPr>
+                <w:rFonts w:ascii="Times New Roman" w:hAnsi="Times New Roman"/>
+                <w:sz w:val="20"/>
+              </w:rPr>
+            </w:r>
+          </w:p>
+        </w:tc>
+        <w:tc>
+          <w:tcPr>
+            <w:tcW w:type="dxa" w:w="1728"/>
+            <w:vAlign w:val="center"/>
+            <w:tcBorders>
+              <w:top w:val="nil"/>
+              <w:left w:val="nil"/>
+              <w:bottom w:val="nil"/>
+              <w:right w:val="nil"/>
+              <w:insideH w:val="nil"/>
+              <w:insideV w:val="nil"/>
+            </w:tcBorders>
+          </w:tcPr>
+          <w:p>
+            <w:pPr>
+              <w:jc w:val="center"/>
+            </w:pPr>
+            <w:r>
+              <w:rPr>
+                <w:rFonts w:ascii="Times New Roman" w:hAnsi="Times New Roman"/>
+                <w:sz w:val="20"/>
+              </w:rPr>
+            </w:r>
+          </w:p>
+        </w:tc>
+        <w:tc>
+          <w:tcPr>
+            <w:tcW w:type="dxa" w:w="1728"/>
+            <w:vAlign w:val="center"/>
+            <w:tcBorders>
+              <w:top w:val="nil"/>
+              <w:left w:val="nil"/>
+              <w:bottom w:val="nil"/>
+              <w:right w:val="nil"/>
+              <w:insideH w:val="nil"/>
+              <w:insideV w:val="nil"/>
+            </w:tcBorders>
+          </w:tcPr>
+          <w:p>
+            <w:pPr>
+              <w:jc w:val="center"/>
+            </w:pPr>
+            <w:r>
+              <w:rPr>
+                <w:rFonts w:ascii="Times New Roman" w:hAnsi="Times New Roman"/>
+                <w:sz w:val="20"/>
+              </w:rPr>
+            </w:r>
+          </w:p>
+        </w:tc>
+        <w:tc>
+          <w:tcPr>
+            <w:tcW w:type="dxa" w:w="1728"/>
+            <w:vAlign w:val="center"/>
+            <w:tcBorders>
+              <w:top w:val="nil"/>
+              <w:left w:val="nil"/>
+              <w:bottom w:val="nil"/>
+              <w:right w:val="nil"/>
+              <w:insideH w:val="nil"/>
+              <w:insideV w:val="nil"/>
+            </w:tcBorders>
+          </w:tcPr>
+          <w:p>
+            <w:pPr>
+              <w:jc w:val="center"/>
+            </w:pPr>
+            <w:r>
+              <w:rPr>
+                <w:rFonts w:ascii="Times New Roman" w:hAnsi="Times New Roman"/>
+                <w:sz w:val="20"/>
+              </w:rPr>
+              <w:t>0.096***</w:t>
+            </w:r>
+          </w:p>
+        </w:tc>
+      </w:tr>
+      <w:tr>
+        <w:tc>
+          <w:tcPr>
+            <w:tcW w:type="dxa" w:w="1728"/>
+            <w:vAlign w:val="center"/>
+            <w:tcBorders>
+              <w:top w:val="nil"/>
+              <w:left w:val="nil"/>
+              <w:bottom w:val="nil"/>
+              <w:right w:val="nil"/>
+              <w:insideH w:val="nil"/>
+              <w:insideV w:val="nil"/>
+            </w:tcBorders>
+          </w:tcPr>
+          <w:p>
+            <w:pPr>
+              <w:jc w:val="left"/>
+            </w:pPr>
+            <w:r>
+              <w:rPr>
+                <w:rFonts w:ascii="Times New Roman" w:hAnsi="Times New Roman"/>
+                <w:sz w:val="20"/>
+              </w:rPr>
+            </w:r>
+          </w:p>
+        </w:tc>
+        <w:tc>
+          <w:tcPr>
+            <w:tcW w:type="dxa" w:w="1728"/>
+            <w:vAlign w:val="center"/>
+            <w:tcBorders>
+              <w:top w:val="nil"/>
+              <w:left w:val="nil"/>
+              <w:bottom w:val="nil"/>
+              <w:right w:val="nil"/>
+              <w:insideH w:val="nil"/>
+              <w:insideV w:val="nil"/>
+            </w:tcBorders>
+          </w:tcPr>
+          <w:p>
+            <w:pPr>
+              <w:jc w:val="center"/>
+            </w:pPr>
+            <w:r>
+              <w:rPr>
+                <w:rFonts w:ascii="Times New Roman" w:hAnsi="Times New Roman"/>
+                <w:sz w:val="20"/>
+              </w:rPr>
+            </w:r>
+          </w:p>
+        </w:tc>
+        <w:tc>
+          <w:tcPr>
+            <w:tcW w:type="dxa" w:w="1728"/>
+            <w:vAlign w:val="center"/>
+            <w:tcBorders>
+              <w:top w:val="nil"/>
+              <w:left w:val="nil"/>
+              <w:bottom w:val="nil"/>
+              <w:right w:val="nil"/>
+              <w:insideH w:val="nil"/>
+              <w:insideV w:val="nil"/>
+            </w:tcBorders>
+          </w:tcPr>
+          <w:p>
+            <w:pPr>
+              <w:jc w:val="center"/>
+            </w:pPr>
+            <w:r>
+              <w:rPr>
+                <w:rFonts w:ascii="Times New Roman" w:hAnsi="Times New Roman"/>
+                <w:sz w:val="20"/>
+              </w:rPr>
+            </w:r>
+          </w:p>
+        </w:tc>
+        <w:tc>
+          <w:tcPr>
+            <w:tcW w:type="dxa" w:w="1728"/>
+            <w:vAlign w:val="center"/>
+            <w:tcBorders>
+              <w:top w:val="nil"/>
+              <w:left w:val="nil"/>
+              <w:bottom w:val="nil"/>
+              <w:right w:val="nil"/>
+              <w:insideH w:val="nil"/>
+              <w:insideV w:val="nil"/>
+            </w:tcBorders>
+          </w:tcPr>
+          <w:p>
+            <w:pPr>
+              <w:jc w:val="center"/>
+            </w:pPr>
+            <w:r>
+              <w:rPr>
+                <w:rFonts w:ascii="Times New Roman" w:hAnsi="Times New Roman"/>
+                <w:sz w:val="20"/>
+              </w:rPr>
+            </w:r>
+          </w:p>
+        </w:tc>
+        <w:tc>
+          <w:tcPr>
+            <w:tcW w:type="dxa" w:w="1728"/>
+            <w:vAlign w:val="center"/>
+            <w:tcBorders>
+              <w:top w:val="nil"/>
+              <w:left w:val="nil"/>
+              <w:bottom w:val="nil"/>
+              <w:right w:val="nil"/>
+              <w:insideH w:val="nil"/>
+              <w:insideV w:val="nil"/>
+            </w:tcBorders>
+          </w:tcPr>
+          <w:p>
+            <w:pPr>
+              <w:jc w:val="center"/>
+            </w:pPr>
+            <w:r>
+              <w:rPr>
+                <w:rFonts w:ascii="Times New Roman" w:hAnsi="Times New Roman"/>
+                <w:sz w:val="20"/>
+              </w:rPr>
+              <w:t>(0.035)</w:t>
+            </w:r>
+          </w:p>
+        </w:tc>
+      </w:tr>
+      <w:tr>
+        <w:tc>
+          <w:tcPr>
+            <w:tcW w:type="dxa" w:w="1728"/>
+            <w:vAlign w:val="center"/>
+            <w:tcBorders>
+              <w:top w:val="nil"/>
+              <w:left w:val="nil"/>
+              <w:bottom w:val="nil"/>
+              <w:right w:val="nil"/>
+              <w:insideH w:val="nil"/>
+              <w:insideV w:val="nil"/>
+            </w:tcBorders>
+          </w:tcPr>
+          <w:p>
+            <w:pPr>
+              <w:jc w:val="left"/>
+            </w:pPr>
+            <w:r>
+              <w:rPr>
+                <w:rFonts w:ascii="Times New Roman" w:hAnsi="Times New Roman"/>
+                <w:sz w:val="20"/>
+              </w:rPr>
+              <w:t>reg663</w:t>
+            </w:r>
+          </w:p>
+        </w:tc>
+        <w:tc>
+          <w:tcPr>
+            <w:tcW w:type="dxa" w:w="1728"/>
+            <w:vAlign w:val="center"/>
+            <w:tcBorders>
+              <w:top w:val="nil"/>
+              <w:left w:val="nil"/>
+              <w:bottom w:val="nil"/>
+              <w:right w:val="nil"/>
+              <w:insideH w:val="nil"/>
+              <w:insideV w:val="nil"/>
+            </w:tcBorders>
+          </w:tcPr>
+          <w:p>
+            <w:pPr>
+              <w:jc w:val="center"/>
+            </w:pPr>
+            <w:r>
+              <w:rPr>
+                <w:rFonts w:ascii="Times New Roman" w:hAnsi="Times New Roman"/>
+                <w:sz w:val="20"/>
+              </w:rPr>
+            </w:r>
+          </w:p>
+        </w:tc>
+        <w:tc>
+          <w:tcPr>
+            <w:tcW w:type="dxa" w:w="1728"/>
+            <w:vAlign w:val="center"/>
+            <w:tcBorders>
+              <w:top w:val="nil"/>
+              <w:left w:val="nil"/>
+              <w:bottom w:val="nil"/>
+              <w:right w:val="nil"/>
+              <w:insideH w:val="nil"/>
+              <w:insideV w:val="nil"/>
+            </w:tcBorders>
+          </w:tcPr>
+          <w:p>
+            <w:pPr>
+              <w:jc w:val="center"/>
+            </w:pPr>
+            <w:r>
+              <w:rPr>
+                <w:rFonts w:ascii="Times New Roman" w:hAnsi="Times New Roman"/>
+                <w:sz w:val="20"/>
+              </w:rPr>
+            </w:r>
+          </w:p>
+        </w:tc>
+        <w:tc>
+          <w:tcPr>
+            <w:tcW w:type="dxa" w:w="1728"/>
+            <w:vAlign w:val="center"/>
+            <w:tcBorders>
+              <w:top w:val="nil"/>
+              <w:left w:val="nil"/>
+              <w:bottom w:val="nil"/>
+              <w:right w:val="nil"/>
+              <w:insideH w:val="nil"/>
+              <w:insideV w:val="nil"/>
+            </w:tcBorders>
+          </w:tcPr>
+          <w:p>
+            <w:pPr>
+              <w:jc w:val="center"/>
+            </w:pPr>
+            <w:r>
+              <w:rPr>
+                <w:rFonts w:ascii="Times New Roman" w:hAnsi="Times New Roman"/>
+                <w:sz w:val="20"/>
+              </w:rPr>
+            </w:r>
+          </w:p>
+        </w:tc>
+        <w:tc>
+          <w:tcPr>
+            <w:tcW w:type="dxa" w:w="1728"/>
+            <w:vAlign w:val="center"/>
+            <w:tcBorders>
+              <w:top w:val="nil"/>
+              <w:left w:val="nil"/>
+              <w:bottom w:val="nil"/>
+              <w:right w:val="nil"/>
+              <w:insideH w:val="nil"/>
+              <w:insideV w:val="nil"/>
+            </w:tcBorders>
+          </w:tcPr>
+          <w:p>
+            <w:pPr>
+              <w:jc w:val="center"/>
+            </w:pPr>
+            <w:r>
+              <w:rPr>
+                <w:rFonts w:ascii="Times New Roman" w:hAnsi="Times New Roman"/>
+                <w:sz w:val="20"/>
+              </w:rPr>
+              <w:t>0.145***</w:t>
+            </w:r>
+          </w:p>
+        </w:tc>
+      </w:tr>
+      <w:tr>
+        <w:tc>
+          <w:tcPr>
+            <w:tcW w:type="dxa" w:w="1728"/>
+            <w:vAlign w:val="center"/>
+            <w:tcBorders>
+              <w:top w:val="nil"/>
+              <w:left w:val="nil"/>
+              <w:bottom w:val="nil"/>
+              <w:right w:val="nil"/>
+              <w:insideH w:val="nil"/>
+              <w:insideV w:val="nil"/>
+            </w:tcBorders>
+          </w:tcPr>
+          <w:p>
+            <w:pPr>
+              <w:jc w:val="left"/>
+            </w:pPr>
+            <w:r>
+              <w:rPr>
+                <w:rFonts w:ascii="Times New Roman" w:hAnsi="Times New Roman"/>
+                <w:sz w:val="20"/>
+              </w:rPr>
+            </w:r>
+          </w:p>
+        </w:tc>
+        <w:tc>
+          <w:tcPr>
+            <w:tcW w:type="dxa" w:w="1728"/>
+            <w:vAlign w:val="center"/>
+            <w:tcBorders>
+              <w:top w:val="nil"/>
+              <w:left w:val="nil"/>
+              <w:bottom w:val="nil"/>
+              <w:right w:val="nil"/>
+              <w:insideH w:val="nil"/>
+              <w:insideV w:val="nil"/>
+            </w:tcBorders>
+          </w:tcPr>
+          <w:p>
+            <w:pPr>
+              <w:jc w:val="center"/>
+            </w:pPr>
+            <w:r>
+              <w:rPr>
+                <w:rFonts w:ascii="Times New Roman" w:hAnsi="Times New Roman"/>
+                <w:sz w:val="20"/>
+              </w:rPr>
+            </w:r>
+          </w:p>
+        </w:tc>
+        <w:tc>
+          <w:tcPr>
+            <w:tcW w:type="dxa" w:w="1728"/>
+            <w:vAlign w:val="center"/>
+            <w:tcBorders>
+              <w:top w:val="nil"/>
+              <w:left w:val="nil"/>
+              <w:bottom w:val="nil"/>
+              <w:right w:val="nil"/>
+              <w:insideH w:val="nil"/>
+              <w:insideV w:val="nil"/>
+            </w:tcBorders>
+          </w:tcPr>
+          <w:p>
+            <w:pPr>
+              <w:jc w:val="center"/>
+            </w:pPr>
+            <w:r>
+              <w:rPr>
+                <w:rFonts w:ascii="Times New Roman" w:hAnsi="Times New Roman"/>
+                <w:sz w:val="20"/>
+              </w:rPr>
+            </w:r>
+          </w:p>
+        </w:tc>
+        <w:tc>
+          <w:tcPr>
+            <w:tcW w:type="dxa" w:w="1728"/>
+            <w:vAlign w:val="center"/>
+            <w:tcBorders>
+              <w:top w:val="nil"/>
+              <w:left w:val="nil"/>
+              <w:bottom w:val="nil"/>
+              <w:right w:val="nil"/>
+              <w:insideH w:val="nil"/>
+              <w:insideV w:val="nil"/>
+            </w:tcBorders>
+          </w:tcPr>
+          <w:p>
+            <w:pPr>
+              <w:jc w:val="center"/>
+            </w:pPr>
+            <w:r>
+              <w:rPr>
+                <w:rFonts w:ascii="Times New Roman" w:hAnsi="Times New Roman"/>
+                <w:sz w:val="20"/>
+              </w:rPr>
+            </w:r>
+          </w:p>
+        </w:tc>
+        <w:tc>
+          <w:tcPr>
+            <w:tcW w:type="dxa" w:w="1728"/>
+            <w:vAlign w:val="center"/>
+            <w:tcBorders>
+              <w:top w:val="nil"/>
+              <w:left w:val="nil"/>
+              <w:bottom w:val="nil"/>
+              <w:right w:val="nil"/>
+              <w:insideH w:val="nil"/>
+              <w:insideV w:val="nil"/>
+            </w:tcBorders>
+          </w:tcPr>
+          <w:p>
+            <w:pPr>
+              <w:jc w:val="center"/>
+            </w:pPr>
+            <w:r>
+              <w:rPr>
+                <w:rFonts w:ascii="Times New Roman" w:hAnsi="Times New Roman"/>
+                <w:sz w:val="20"/>
+              </w:rPr>
+              <w:t>(0.034)</w:t>
+            </w:r>
+          </w:p>
+        </w:tc>
+      </w:tr>
+      <w:tr>
+        <w:tc>
+          <w:tcPr>
+            <w:tcW w:type="dxa" w:w="1728"/>
+            <w:vAlign w:val="center"/>
+            <w:tcBorders>
+              <w:top w:val="nil"/>
+              <w:left w:val="nil"/>
+              <w:bottom w:val="nil"/>
+              <w:right w:val="nil"/>
+              <w:insideH w:val="nil"/>
+              <w:insideV w:val="nil"/>
+            </w:tcBorders>
+          </w:tcPr>
+          <w:p>
+            <w:pPr>
+              <w:jc w:val="left"/>
+            </w:pPr>
+            <w:r>
+              <w:rPr>
+                <w:rFonts w:ascii="Times New Roman" w:hAnsi="Times New Roman"/>
+                <w:sz w:val="20"/>
+              </w:rPr>
+              <w:t>reg664</w:t>
+            </w:r>
+          </w:p>
+        </w:tc>
+        <w:tc>
+          <w:tcPr>
+            <w:tcW w:type="dxa" w:w="1728"/>
+            <w:vAlign w:val="center"/>
+            <w:tcBorders>
+              <w:top w:val="nil"/>
+              <w:left w:val="nil"/>
+              <w:bottom w:val="nil"/>
+              <w:right w:val="nil"/>
+              <w:insideH w:val="nil"/>
+              <w:insideV w:val="nil"/>
+            </w:tcBorders>
+          </w:tcPr>
+          <w:p>
+            <w:pPr>
+              <w:jc w:val="center"/>
+            </w:pPr>
+            <w:r>
+              <w:rPr>
+                <w:rFonts w:ascii="Times New Roman" w:hAnsi="Times New Roman"/>
+                <w:sz w:val="20"/>
+              </w:rPr>
+            </w:r>
+          </w:p>
+        </w:tc>
+        <w:tc>
+          <w:tcPr>
+            <w:tcW w:type="dxa" w:w="1728"/>
+            <w:vAlign w:val="center"/>
+            <w:tcBorders>
+              <w:top w:val="nil"/>
+              <w:left w:val="nil"/>
+              <w:bottom w:val="nil"/>
+              <w:right w:val="nil"/>
+              <w:insideH w:val="nil"/>
+              <w:insideV w:val="nil"/>
+            </w:tcBorders>
+          </w:tcPr>
+          <w:p>
+            <w:pPr>
+              <w:jc w:val="center"/>
+            </w:pPr>
+            <w:r>
+              <w:rPr>
+                <w:rFonts w:ascii="Times New Roman" w:hAnsi="Times New Roman"/>
+                <w:sz w:val="20"/>
+              </w:rPr>
+            </w:r>
+          </w:p>
+        </w:tc>
+        <w:tc>
+          <w:tcPr>
+            <w:tcW w:type="dxa" w:w="1728"/>
+            <w:vAlign w:val="center"/>
+            <w:tcBorders>
+              <w:top w:val="nil"/>
+              <w:left w:val="nil"/>
+              <w:bottom w:val="nil"/>
+              <w:right w:val="nil"/>
+              <w:insideH w:val="nil"/>
+              <w:insideV w:val="nil"/>
+            </w:tcBorders>
+          </w:tcPr>
+          <w:p>
+            <w:pPr>
+              <w:jc w:val="center"/>
+            </w:pPr>
+            <w:r>
+              <w:rPr>
+                <w:rFonts w:ascii="Times New Roman" w:hAnsi="Times New Roman"/>
+                <w:sz w:val="20"/>
+              </w:rPr>
+            </w:r>
+          </w:p>
+        </w:tc>
+        <w:tc>
+          <w:tcPr>
+            <w:tcW w:type="dxa" w:w="1728"/>
+            <w:vAlign w:val="center"/>
+            <w:tcBorders>
+              <w:top w:val="nil"/>
+              <w:left w:val="nil"/>
+              <w:bottom w:val="nil"/>
+              <w:right w:val="nil"/>
+              <w:insideH w:val="nil"/>
+              <w:insideV w:val="nil"/>
+            </w:tcBorders>
+          </w:tcPr>
+          <w:p>
+            <w:pPr>
+              <w:jc w:val="center"/>
+            </w:pPr>
+            <w:r>
+              <w:rPr>
+                <w:rFonts w:ascii="Times New Roman" w:hAnsi="Times New Roman"/>
+                <w:sz w:val="20"/>
+              </w:rPr>
+              <w:t>0.055</w:t>
+            </w:r>
+          </w:p>
+        </w:tc>
+      </w:tr>
+      <w:tr>
+        <w:tc>
+          <w:tcPr>
+            <w:tcW w:type="dxa" w:w="1728"/>
+            <w:vAlign w:val="center"/>
+            <w:tcBorders>
+              <w:top w:val="nil"/>
+              <w:left w:val="nil"/>
+              <w:bottom w:val="nil"/>
+              <w:right w:val="nil"/>
+              <w:insideH w:val="nil"/>
+              <w:insideV w:val="nil"/>
+            </w:tcBorders>
+          </w:tcPr>
+          <w:p>
+            <w:pPr>
+              <w:jc w:val="left"/>
+            </w:pPr>
+            <w:r>
+              <w:rPr>
+                <w:rFonts w:ascii="Times New Roman" w:hAnsi="Times New Roman"/>
+                <w:sz w:val="20"/>
+              </w:rPr>
+            </w:r>
+          </w:p>
+        </w:tc>
+        <w:tc>
+          <w:tcPr>
+            <w:tcW w:type="dxa" w:w="1728"/>
+            <w:vAlign w:val="center"/>
+            <w:tcBorders>
+              <w:top w:val="nil"/>
+              <w:left w:val="nil"/>
+              <w:bottom w:val="nil"/>
+              <w:right w:val="nil"/>
+              <w:insideH w:val="nil"/>
+              <w:insideV w:val="nil"/>
+            </w:tcBorders>
+          </w:tcPr>
+          <w:p>
+            <w:pPr>
+              <w:jc w:val="center"/>
+            </w:pPr>
+            <w:r>
+              <w:rPr>
+                <w:rFonts w:ascii="Times New Roman" w:hAnsi="Times New Roman"/>
+                <w:sz w:val="20"/>
+              </w:rPr>
+            </w:r>
+          </w:p>
+        </w:tc>
+        <w:tc>
+          <w:tcPr>
+            <w:tcW w:type="dxa" w:w="1728"/>
+            <w:vAlign w:val="center"/>
+            <w:tcBorders>
+              <w:top w:val="nil"/>
+              <w:left w:val="nil"/>
+              <w:bottom w:val="nil"/>
+              <w:right w:val="nil"/>
+              <w:insideH w:val="nil"/>
+              <w:insideV w:val="nil"/>
+            </w:tcBorders>
+          </w:tcPr>
+          <w:p>
+            <w:pPr>
+              <w:jc w:val="center"/>
+            </w:pPr>
+            <w:r>
+              <w:rPr>
+                <w:rFonts w:ascii="Times New Roman" w:hAnsi="Times New Roman"/>
+                <w:sz w:val="20"/>
+              </w:rPr>
+            </w:r>
+          </w:p>
+        </w:tc>
+        <w:tc>
+          <w:tcPr>
+            <w:tcW w:type="dxa" w:w="1728"/>
+            <w:vAlign w:val="center"/>
+            <w:tcBorders>
+              <w:top w:val="nil"/>
+              <w:left w:val="nil"/>
+              <w:bottom w:val="nil"/>
+              <w:right w:val="nil"/>
+              <w:insideH w:val="nil"/>
+              <w:insideV w:val="nil"/>
+            </w:tcBorders>
+          </w:tcPr>
+          <w:p>
+            <w:pPr>
+              <w:jc w:val="center"/>
+            </w:pPr>
+            <w:r>
+              <w:rPr>
+                <w:rFonts w:ascii="Times New Roman" w:hAnsi="Times New Roman"/>
+                <w:sz w:val="20"/>
+              </w:rPr>
+            </w:r>
+          </w:p>
+        </w:tc>
+        <w:tc>
+          <w:tcPr>
+            <w:tcW w:type="dxa" w:w="1728"/>
+            <w:vAlign w:val="center"/>
+            <w:tcBorders>
+              <w:top w:val="nil"/>
+              <w:left w:val="nil"/>
+              <w:bottom w:val="nil"/>
+              <w:right w:val="nil"/>
+              <w:insideH w:val="nil"/>
+              <w:insideV w:val="nil"/>
+            </w:tcBorders>
+          </w:tcPr>
+          <w:p>
+            <w:pPr>
+              <w:jc w:val="center"/>
+            </w:pPr>
+            <w:r>
+              <w:rPr>
+                <w:rFonts w:ascii="Times New Roman" w:hAnsi="Times New Roman"/>
+                <w:sz w:val="20"/>
+              </w:rPr>
+              <w:t>(0.041)</w:t>
+            </w:r>
+          </w:p>
+        </w:tc>
+      </w:tr>
+      <w:tr>
+        <w:tc>
+          <w:tcPr>
+            <w:tcW w:type="dxa" w:w="1728"/>
+            <w:vAlign w:val="center"/>
+            <w:tcBorders>
+              <w:top w:val="nil"/>
+              <w:left w:val="nil"/>
+              <w:bottom w:val="nil"/>
+              <w:right w:val="nil"/>
+              <w:insideH w:val="nil"/>
+              <w:insideV w:val="nil"/>
+            </w:tcBorders>
+          </w:tcPr>
+          <w:p>
+            <w:pPr>
+              <w:jc w:val="left"/>
+            </w:pPr>
+            <w:r>
+              <w:rPr>
+                <w:rFonts w:ascii="Times New Roman" w:hAnsi="Times New Roman"/>
+                <w:sz w:val="20"/>
+              </w:rPr>
+              <w:t>reg665</w:t>
+            </w:r>
+          </w:p>
+        </w:tc>
+        <w:tc>
+          <w:tcPr>
+            <w:tcW w:type="dxa" w:w="1728"/>
+            <w:vAlign w:val="center"/>
+            <w:tcBorders>
+              <w:top w:val="nil"/>
+              <w:left w:val="nil"/>
+              <w:bottom w:val="nil"/>
+              <w:right w:val="nil"/>
+              <w:insideH w:val="nil"/>
+              <w:insideV w:val="nil"/>
+            </w:tcBorders>
+          </w:tcPr>
+          <w:p>
+            <w:pPr>
+              <w:jc w:val="center"/>
+            </w:pPr>
+            <w:r>
+              <w:rPr>
+                <w:rFonts w:ascii="Times New Roman" w:hAnsi="Times New Roman"/>
+                <w:sz w:val="20"/>
+              </w:rPr>
+            </w:r>
+          </w:p>
+        </w:tc>
+        <w:tc>
+          <w:tcPr>
+            <w:tcW w:type="dxa" w:w="1728"/>
+            <w:vAlign w:val="center"/>
+            <w:tcBorders>
+              <w:top w:val="nil"/>
+              <w:left w:val="nil"/>
+              <w:bottom w:val="nil"/>
+              <w:right w:val="nil"/>
+              <w:insideH w:val="nil"/>
+              <w:insideV w:val="nil"/>
+            </w:tcBorders>
+          </w:tcPr>
+          <w:p>
+            <w:pPr>
+              <w:jc w:val="center"/>
+            </w:pPr>
+            <w:r>
+              <w:rPr>
+                <w:rFonts w:ascii="Times New Roman" w:hAnsi="Times New Roman"/>
+                <w:sz w:val="20"/>
+              </w:rPr>
+            </w:r>
+          </w:p>
+        </w:tc>
+        <w:tc>
+          <w:tcPr>
+            <w:tcW w:type="dxa" w:w="1728"/>
+            <w:vAlign w:val="center"/>
+            <w:tcBorders>
+              <w:top w:val="nil"/>
+              <w:left w:val="nil"/>
+              <w:bottom w:val="nil"/>
+              <w:right w:val="nil"/>
+              <w:insideH w:val="nil"/>
+              <w:insideV w:val="nil"/>
+            </w:tcBorders>
+          </w:tcPr>
+          <w:p>
+            <w:pPr>
+              <w:jc w:val="center"/>
+            </w:pPr>
+            <w:r>
+              <w:rPr>
+                <w:rFonts w:ascii="Times New Roman" w:hAnsi="Times New Roman"/>
+                <w:sz w:val="20"/>
+              </w:rPr>
+            </w:r>
+          </w:p>
+        </w:tc>
+        <w:tc>
+          <w:tcPr>
+            <w:tcW w:type="dxa" w:w="1728"/>
+            <w:vAlign w:val="center"/>
+            <w:tcBorders>
+              <w:top w:val="nil"/>
+              <w:left w:val="nil"/>
+              <w:bottom w:val="nil"/>
+              <w:right w:val="nil"/>
+              <w:insideH w:val="nil"/>
+              <w:insideV w:val="nil"/>
+            </w:tcBorders>
+          </w:tcPr>
+          <w:p>
+            <w:pPr>
+              <w:jc w:val="center"/>
+            </w:pPr>
+            <w:r>
+              <w:rPr>
+                <w:rFonts w:ascii="Times New Roman" w:hAnsi="Times New Roman"/>
+                <w:sz w:val="20"/>
+              </w:rPr>
+              <w:t>0.128***</w:t>
+            </w:r>
+          </w:p>
+        </w:tc>
+      </w:tr>
+      <w:tr>
+        <w:tc>
+          <w:tcPr>
+            <w:tcW w:type="dxa" w:w="1728"/>
+            <w:vAlign w:val="center"/>
+            <w:tcBorders>
+              <w:top w:val="nil"/>
+              <w:left w:val="nil"/>
+              <w:bottom w:val="nil"/>
+              <w:right w:val="nil"/>
+              <w:insideH w:val="nil"/>
+              <w:insideV w:val="nil"/>
+            </w:tcBorders>
+          </w:tcPr>
+          <w:p>
+            <w:pPr>
+              <w:jc w:val="left"/>
+            </w:pPr>
+            <w:r>
+              <w:rPr>
+                <w:rFonts w:ascii="Times New Roman" w:hAnsi="Times New Roman"/>
+                <w:sz w:val="20"/>
+              </w:rPr>
+            </w:r>
+          </w:p>
+        </w:tc>
+        <w:tc>
+          <w:tcPr>
+            <w:tcW w:type="dxa" w:w="1728"/>
+            <w:vAlign w:val="center"/>
+            <w:tcBorders>
+              <w:top w:val="nil"/>
+              <w:left w:val="nil"/>
+              <w:bottom w:val="nil"/>
+              <w:right w:val="nil"/>
+              <w:insideH w:val="nil"/>
+              <w:insideV w:val="nil"/>
+            </w:tcBorders>
+          </w:tcPr>
+          <w:p>
+            <w:pPr>
+              <w:jc w:val="center"/>
+            </w:pPr>
+            <w:r>
+              <w:rPr>
+                <w:rFonts w:ascii="Times New Roman" w:hAnsi="Times New Roman"/>
+                <w:sz w:val="20"/>
+              </w:rPr>
+            </w:r>
+          </w:p>
+        </w:tc>
+        <w:tc>
+          <w:tcPr>
+            <w:tcW w:type="dxa" w:w="1728"/>
+            <w:vAlign w:val="center"/>
+            <w:tcBorders>
+              <w:top w:val="nil"/>
+              <w:left w:val="nil"/>
+              <w:bottom w:val="nil"/>
+              <w:right w:val="nil"/>
+              <w:insideH w:val="nil"/>
+              <w:insideV w:val="nil"/>
+            </w:tcBorders>
+          </w:tcPr>
+          <w:p>
+            <w:pPr>
+              <w:jc w:val="center"/>
+            </w:pPr>
+            <w:r>
+              <w:rPr>
+                <w:rFonts w:ascii="Times New Roman" w:hAnsi="Times New Roman"/>
+                <w:sz w:val="20"/>
+              </w:rPr>
+            </w:r>
+          </w:p>
+        </w:tc>
+        <w:tc>
+          <w:tcPr>
+            <w:tcW w:type="dxa" w:w="1728"/>
+            <w:vAlign w:val="center"/>
+            <w:tcBorders>
+              <w:top w:val="nil"/>
+              <w:left w:val="nil"/>
+              <w:bottom w:val="nil"/>
+              <w:right w:val="nil"/>
+              <w:insideH w:val="nil"/>
+              <w:insideV w:val="nil"/>
+            </w:tcBorders>
+          </w:tcPr>
+          <w:p>
+            <w:pPr>
+              <w:jc w:val="center"/>
+            </w:pPr>
+            <w:r>
+              <w:rPr>
+                <w:rFonts w:ascii="Times New Roman" w:hAnsi="Times New Roman"/>
+                <w:sz w:val="20"/>
+              </w:rPr>
+            </w:r>
+          </w:p>
+        </w:tc>
+        <w:tc>
+          <w:tcPr>
+            <w:tcW w:type="dxa" w:w="1728"/>
+            <w:vAlign w:val="center"/>
+            <w:tcBorders>
+              <w:top w:val="nil"/>
+              <w:left w:val="nil"/>
+              <w:bottom w:val="nil"/>
+              <w:right w:val="nil"/>
+              <w:insideH w:val="nil"/>
+              <w:insideV w:val="nil"/>
+            </w:tcBorders>
+          </w:tcPr>
+          <w:p>
+            <w:pPr>
+              <w:jc w:val="center"/>
+            </w:pPr>
+            <w:r>
+              <w:rPr>
+                <w:rFonts w:ascii="Times New Roman" w:hAnsi="Times New Roman"/>
+                <w:sz w:val="20"/>
+              </w:rPr>
+              <w:t>(0.043)</w:t>
+            </w:r>
+          </w:p>
+        </w:tc>
+      </w:tr>
+      <w:tr>
+        <w:tc>
+          <w:tcPr>
+            <w:tcW w:type="dxa" w:w="1728"/>
+            <w:vAlign w:val="center"/>
+            <w:tcBorders>
+              <w:top w:val="nil"/>
+              <w:left w:val="nil"/>
+              <w:bottom w:val="nil"/>
+              <w:right w:val="nil"/>
+              <w:insideH w:val="nil"/>
+              <w:insideV w:val="nil"/>
+            </w:tcBorders>
+          </w:tcPr>
+          <w:p>
+            <w:pPr>
+              <w:jc w:val="left"/>
+            </w:pPr>
+            <w:r>
+              <w:rPr>
+                <w:rFonts w:ascii="Times New Roman" w:hAnsi="Times New Roman"/>
+                <w:sz w:val="20"/>
+              </w:rPr>
+              <w:t>reg666</w:t>
+            </w:r>
+          </w:p>
+        </w:tc>
+        <w:tc>
+          <w:tcPr>
+            <w:tcW w:type="dxa" w:w="1728"/>
+            <w:vAlign w:val="center"/>
+            <w:tcBorders>
+              <w:top w:val="nil"/>
+              <w:left w:val="nil"/>
+              <w:bottom w:val="nil"/>
+              <w:right w:val="nil"/>
+              <w:insideH w:val="nil"/>
+              <w:insideV w:val="nil"/>
+            </w:tcBorders>
+          </w:tcPr>
+          <w:p>
+            <w:pPr>
+              <w:jc w:val="center"/>
+            </w:pPr>
+            <w:r>
+              <w:rPr>
+                <w:rFonts w:ascii="Times New Roman" w:hAnsi="Times New Roman"/>
+                <w:sz w:val="20"/>
+              </w:rPr>
+            </w:r>
+          </w:p>
+        </w:tc>
+        <w:tc>
+          <w:tcPr>
+            <w:tcW w:type="dxa" w:w="1728"/>
+            <w:vAlign w:val="center"/>
+            <w:tcBorders>
+              <w:top w:val="nil"/>
+              <w:left w:val="nil"/>
+              <w:bottom w:val="nil"/>
+              <w:right w:val="nil"/>
+              <w:insideH w:val="nil"/>
+              <w:insideV w:val="nil"/>
+            </w:tcBorders>
+          </w:tcPr>
+          <w:p>
+            <w:pPr>
+              <w:jc w:val="center"/>
+            </w:pPr>
+            <w:r>
+              <w:rPr>
+                <w:rFonts w:ascii="Times New Roman" w:hAnsi="Times New Roman"/>
+                <w:sz w:val="20"/>
+              </w:rPr>
+            </w:r>
+          </w:p>
+        </w:tc>
+        <w:tc>
+          <w:tcPr>
+            <w:tcW w:type="dxa" w:w="1728"/>
+            <w:vAlign w:val="center"/>
+            <w:tcBorders>
+              <w:top w:val="nil"/>
+              <w:left w:val="nil"/>
+              <w:bottom w:val="nil"/>
+              <w:right w:val="nil"/>
+              <w:insideH w:val="nil"/>
+              <w:insideV w:val="nil"/>
+            </w:tcBorders>
+          </w:tcPr>
+          <w:p>
+            <w:pPr>
+              <w:jc w:val="center"/>
+            </w:pPr>
+            <w:r>
+              <w:rPr>
+                <w:rFonts w:ascii="Times New Roman" w:hAnsi="Times New Roman"/>
+                <w:sz w:val="20"/>
+              </w:rPr>
+            </w:r>
+          </w:p>
+        </w:tc>
+        <w:tc>
+          <w:tcPr>
+            <w:tcW w:type="dxa" w:w="1728"/>
+            <w:vAlign w:val="center"/>
+            <w:tcBorders>
+              <w:top w:val="nil"/>
+              <w:left w:val="nil"/>
+              <w:bottom w:val="nil"/>
+              <w:right w:val="nil"/>
+              <w:insideH w:val="nil"/>
+              <w:insideV w:val="nil"/>
+            </w:tcBorders>
+          </w:tcPr>
+          <w:p>
+            <w:pPr>
+              <w:jc w:val="center"/>
+            </w:pPr>
+            <w:r>
+              <w:rPr>
+                <w:rFonts w:ascii="Times New Roman" w:hAnsi="Times New Roman"/>
+                <w:sz w:val="20"/>
+              </w:rPr>
+              <w:t>0.141***</w:t>
+            </w:r>
+          </w:p>
+        </w:tc>
+      </w:tr>
+      <w:tr>
+        <w:tc>
+          <w:tcPr>
+            <w:tcW w:type="dxa" w:w="1728"/>
+            <w:vAlign w:val="center"/>
+            <w:tcBorders>
+              <w:top w:val="nil"/>
+              <w:left w:val="nil"/>
+              <w:bottom w:val="nil"/>
+              <w:right w:val="nil"/>
+              <w:insideH w:val="nil"/>
+              <w:insideV w:val="nil"/>
+            </w:tcBorders>
+          </w:tcPr>
+          <w:p>
+            <w:pPr>
+              <w:jc w:val="left"/>
+            </w:pPr>
+            <w:r>
+              <w:rPr>
+                <w:rFonts w:ascii="Times New Roman" w:hAnsi="Times New Roman"/>
+                <w:sz w:val="20"/>
+              </w:rPr>
+            </w:r>
+          </w:p>
+        </w:tc>
+        <w:tc>
+          <w:tcPr>
+            <w:tcW w:type="dxa" w:w="1728"/>
+            <w:vAlign w:val="center"/>
+            <w:tcBorders>
+              <w:top w:val="nil"/>
+              <w:left w:val="nil"/>
+              <w:bottom w:val="nil"/>
+              <w:right w:val="nil"/>
+              <w:insideH w:val="nil"/>
+              <w:insideV w:val="nil"/>
+            </w:tcBorders>
+          </w:tcPr>
+          <w:p>
+            <w:pPr>
+              <w:jc w:val="center"/>
+            </w:pPr>
+            <w:r>
+              <w:rPr>
+                <w:rFonts w:ascii="Times New Roman" w:hAnsi="Times New Roman"/>
+                <w:sz w:val="20"/>
+              </w:rPr>
+            </w:r>
+          </w:p>
+        </w:tc>
+        <w:tc>
+          <w:tcPr>
+            <w:tcW w:type="dxa" w:w="1728"/>
+            <w:vAlign w:val="center"/>
+            <w:tcBorders>
+              <w:top w:val="nil"/>
+              <w:left w:val="nil"/>
+              <w:bottom w:val="nil"/>
+              <w:right w:val="nil"/>
+              <w:insideH w:val="nil"/>
+              <w:insideV w:val="nil"/>
+            </w:tcBorders>
+          </w:tcPr>
+          <w:p>
+            <w:pPr>
+              <w:jc w:val="center"/>
+            </w:pPr>
+            <w:r>
+              <w:rPr>
+                <w:rFonts w:ascii="Times New Roman" w:hAnsi="Times New Roman"/>
+                <w:sz w:val="20"/>
+              </w:rPr>
+            </w:r>
+          </w:p>
+        </w:tc>
+        <w:tc>
+          <w:tcPr>
+            <w:tcW w:type="dxa" w:w="1728"/>
+            <w:vAlign w:val="center"/>
+            <w:tcBorders>
+              <w:top w:val="nil"/>
+              <w:left w:val="nil"/>
+              <w:bottom w:val="nil"/>
+              <w:right w:val="nil"/>
+              <w:insideH w:val="nil"/>
+              <w:insideV w:val="nil"/>
+            </w:tcBorders>
+          </w:tcPr>
+          <w:p>
+            <w:pPr>
+              <w:jc w:val="center"/>
+            </w:pPr>
+            <w:r>
+              <w:rPr>
+                <w:rFonts w:ascii="Times New Roman" w:hAnsi="Times New Roman"/>
+                <w:sz w:val="20"/>
+              </w:rPr>
+            </w:r>
+          </w:p>
+        </w:tc>
+        <w:tc>
+          <w:tcPr>
+            <w:tcW w:type="dxa" w:w="1728"/>
+            <w:vAlign w:val="center"/>
+            <w:tcBorders>
+              <w:top w:val="nil"/>
+              <w:left w:val="nil"/>
+              <w:bottom w:val="nil"/>
+              <w:right w:val="nil"/>
+              <w:insideH w:val="nil"/>
+              <w:insideV w:val="nil"/>
+            </w:tcBorders>
+          </w:tcPr>
+          <w:p>
+            <w:pPr>
+              <w:jc w:val="center"/>
+            </w:pPr>
+            <w:r>
+              <w:rPr>
+                <w:rFonts w:ascii="Times New Roman" w:hAnsi="Times New Roman"/>
+                <w:sz w:val="20"/>
+              </w:rPr>
+              <w:t>(0.045)</w:t>
+            </w:r>
+          </w:p>
+        </w:tc>
+      </w:tr>
+      <w:tr>
+        <w:tc>
+          <w:tcPr>
+            <w:tcW w:type="dxa" w:w="1728"/>
+            <w:vAlign w:val="center"/>
+            <w:tcBorders>
+              <w:top w:val="nil"/>
+              <w:left w:val="nil"/>
+              <w:bottom w:val="nil"/>
+              <w:right w:val="nil"/>
+              <w:insideH w:val="nil"/>
+              <w:insideV w:val="nil"/>
+            </w:tcBorders>
+          </w:tcPr>
+          <w:p>
+            <w:pPr>
+              <w:jc w:val="left"/>
+            </w:pPr>
+            <w:r>
+              <w:rPr>
+                <w:rFonts w:ascii="Times New Roman" w:hAnsi="Times New Roman"/>
+                <w:sz w:val="20"/>
+              </w:rPr>
+              <w:t>reg667</w:t>
+            </w:r>
+          </w:p>
+        </w:tc>
+        <w:tc>
+          <w:tcPr>
+            <w:tcW w:type="dxa" w:w="1728"/>
+            <w:vAlign w:val="center"/>
+            <w:tcBorders>
+              <w:top w:val="nil"/>
+              <w:left w:val="nil"/>
+              <w:bottom w:val="nil"/>
+              <w:right w:val="nil"/>
+              <w:insideH w:val="nil"/>
+              <w:insideV w:val="nil"/>
+            </w:tcBorders>
+          </w:tcPr>
+          <w:p>
+            <w:pPr>
+              <w:jc w:val="center"/>
+            </w:pPr>
+            <w:r>
+              <w:rPr>
+                <w:rFonts w:ascii="Times New Roman" w:hAnsi="Times New Roman"/>
+                <w:sz w:val="20"/>
+              </w:rPr>
+            </w:r>
+          </w:p>
+        </w:tc>
+        <w:tc>
+          <w:tcPr>
+            <w:tcW w:type="dxa" w:w="1728"/>
+            <w:vAlign w:val="center"/>
+            <w:tcBorders>
+              <w:top w:val="nil"/>
+              <w:left w:val="nil"/>
+              <w:bottom w:val="nil"/>
+              <w:right w:val="nil"/>
+              <w:insideH w:val="nil"/>
+              <w:insideV w:val="nil"/>
+            </w:tcBorders>
+          </w:tcPr>
+          <w:p>
+            <w:pPr>
+              <w:jc w:val="center"/>
+            </w:pPr>
+            <w:r>
+              <w:rPr>
+                <w:rFonts w:ascii="Times New Roman" w:hAnsi="Times New Roman"/>
+                <w:sz w:val="20"/>
+              </w:rPr>
+            </w:r>
+          </w:p>
+        </w:tc>
+        <w:tc>
+          <w:tcPr>
+            <w:tcW w:type="dxa" w:w="1728"/>
+            <w:vAlign w:val="center"/>
+            <w:tcBorders>
+              <w:top w:val="nil"/>
+              <w:left w:val="nil"/>
+              <w:bottom w:val="nil"/>
+              <w:right w:val="nil"/>
+              <w:insideH w:val="nil"/>
+              <w:insideV w:val="nil"/>
+            </w:tcBorders>
+          </w:tcPr>
+          <w:p>
+            <w:pPr>
+              <w:jc w:val="center"/>
+            </w:pPr>
+            <w:r>
+              <w:rPr>
+                <w:rFonts w:ascii="Times New Roman" w:hAnsi="Times New Roman"/>
+                <w:sz w:val="20"/>
+              </w:rPr>
+            </w:r>
+          </w:p>
+        </w:tc>
+        <w:tc>
+          <w:tcPr>
+            <w:tcW w:type="dxa" w:w="1728"/>
+            <w:vAlign w:val="center"/>
+            <w:tcBorders>
+              <w:top w:val="nil"/>
+              <w:left w:val="nil"/>
+              <w:bottom w:val="nil"/>
+              <w:right w:val="nil"/>
+              <w:insideH w:val="nil"/>
+              <w:insideV w:val="nil"/>
+            </w:tcBorders>
+          </w:tcPr>
+          <w:p>
+            <w:pPr>
+              <w:jc w:val="center"/>
+            </w:pPr>
+            <w:r>
+              <w:rPr>
+                <w:rFonts w:ascii="Times New Roman" w:hAnsi="Times New Roman"/>
+                <w:sz w:val="20"/>
+              </w:rPr>
+              <w:t>0.118***</w:t>
+            </w:r>
+          </w:p>
+        </w:tc>
+      </w:tr>
+      <w:tr>
+        <w:tc>
+          <w:tcPr>
+            <w:tcW w:type="dxa" w:w="1728"/>
+            <w:vAlign w:val="center"/>
+            <w:tcBorders>
+              <w:top w:val="nil"/>
+              <w:left w:val="nil"/>
+              <w:bottom w:val="nil"/>
+              <w:right w:val="nil"/>
+              <w:insideH w:val="nil"/>
+              <w:insideV w:val="nil"/>
+            </w:tcBorders>
+          </w:tcPr>
+          <w:p>
+            <w:pPr>
+              <w:jc w:val="left"/>
+            </w:pPr>
+            <w:r>
+              <w:rPr>
+                <w:rFonts w:ascii="Times New Roman" w:hAnsi="Times New Roman"/>
+                <w:sz w:val="20"/>
+              </w:rPr>
+            </w:r>
+          </w:p>
+        </w:tc>
+        <w:tc>
+          <w:tcPr>
+            <w:tcW w:type="dxa" w:w="1728"/>
+            <w:vAlign w:val="center"/>
+            <w:tcBorders>
+              <w:top w:val="nil"/>
+              <w:left w:val="nil"/>
+              <w:bottom w:val="nil"/>
+              <w:right w:val="nil"/>
+              <w:insideH w:val="nil"/>
+              <w:insideV w:val="nil"/>
+            </w:tcBorders>
+          </w:tcPr>
+          <w:p>
+            <w:pPr>
+              <w:jc w:val="center"/>
+            </w:pPr>
+            <w:r>
+              <w:rPr>
+                <w:rFonts w:ascii="Times New Roman" w:hAnsi="Times New Roman"/>
+                <w:sz w:val="20"/>
+              </w:rPr>
+            </w:r>
+          </w:p>
+        </w:tc>
+        <w:tc>
+          <w:tcPr>
+            <w:tcW w:type="dxa" w:w="1728"/>
+            <w:vAlign w:val="center"/>
+            <w:tcBorders>
+              <w:top w:val="nil"/>
+              <w:left w:val="nil"/>
+              <w:bottom w:val="nil"/>
+              <w:right w:val="nil"/>
+              <w:insideH w:val="nil"/>
+              <w:insideV w:val="nil"/>
+            </w:tcBorders>
+          </w:tcPr>
+          <w:p>
+            <w:pPr>
+              <w:jc w:val="center"/>
+            </w:pPr>
+            <w:r>
+              <w:rPr>
+                <w:rFonts w:ascii="Times New Roman" w:hAnsi="Times New Roman"/>
+                <w:sz w:val="20"/>
+              </w:rPr>
+            </w:r>
+          </w:p>
+        </w:tc>
+        <w:tc>
+          <w:tcPr>
+            <w:tcW w:type="dxa" w:w="1728"/>
+            <w:vAlign w:val="center"/>
+            <w:tcBorders>
+              <w:top w:val="nil"/>
+              <w:left w:val="nil"/>
+              <w:bottom w:val="nil"/>
+              <w:right w:val="nil"/>
+              <w:insideH w:val="nil"/>
+              <w:insideV w:val="nil"/>
+            </w:tcBorders>
+          </w:tcPr>
+          <w:p>
+            <w:pPr>
+              <w:jc w:val="center"/>
+            </w:pPr>
+            <w:r>
+              <w:rPr>
+                <w:rFonts w:ascii="Times New Roman" w:hAnsi="Times New Roman"/>
+                <w:sz w:val="20"/>
+              </w:rPr>
+            </w:r>
+          </w:p>
+        </w:tc>
+        <w:tc>
+          <w:tcPr>
+            <w:tcW w:type="dxa" w:w="1728"/>
+            <w:vAlign w:val="center"/>
+            <w:tcBorders>
+              <w:top w:val="nil"/>
+              <w:left w:val="nil"/>
+              <w:bottom w:val="nil"/>
+              <w:right w:val="nil"/>
+              <w:insideH w:val="nil"/>
+              <w:insideV w:val="nil"/>
+            </w:tcBorders>
+          </w:tcPr>
+          <w:p>
+            <w:pPr>
+              <w:jc w:val="center"/>
+            </w:pPr>
+            <w:r>
+              <w:rPr>
+                <w:rFonts w:ascii="Times New Roman" w:hAnsi="Times New Roman"/>
+                <w:sz w:val="20"/>
+              </w:rPr>
+              <w:t>(0.046)</w:t>
+            </w:r>
+          </w:p>
+        </w:tc>
+      </w:tr>
+      <w:tr>
+        <w:tc>
+          <w:tcPr>
+            <w:tcW w:type="dxa" w:w="1728"/>
+            <w:vAlign w:val="center"/>
+            <w:tcBorders>
+              <w:top w:val="nil"/>
+              <w:left w:val="nil"/>
+              <w:bottom w:val="nil"/>
+              <w:right w:val="nil"/>
+              <w:insideH w:val="nil"/>
+              <w:insideV w:val="nil"/>
+            </w:tcBorders>
+          </w:tcPr>
+          <w:p>
+            <w:pPr>
+              <w:jc w:val="left"/>
+            </w:pPr>
+            <w:r>
+              <w:rPr>
+                <w:rFonts w:ascii="Times New Roman" w:hAnsi="Times New Roman"/>
+                <w:sz w:val="20"/>
+              </w:rPr>
+              <w:t>reg668</w:t>
+            </w:r>
+          </w:p>
+        </w:tc>
+        <w:tc>
+          <w:tcPr>
+            <w:tcW w:type="dxa" w:w="1728"/>
+            <w:vAlign w:val="center"/>
+            <w:tcBorders>
+              <w:top w:val="nil"/>
+              <w:left w:val="nil"/>
+              <w:bottom w:val="nil"/>
+              <w:right w:val="nil"/>
+              <w:insideH w:val="nil"/>
+              <w:insideV w:val="nil"/>
+            </w:tcBorders>
+          </w:tcPr>
+          <w:p>
+            <w:pPr>
+              <w:jc w:val="center"/>
+            </w:pPr>
+            <w:r>
+              <w:rPr>
+                <w:rFonts w:ascii="Times New Roman" w:hAnsi="Times New Roman"/>
+                <w:sz w:val="20"/>
+              </w:rPr>
+            </w:r>
+          </w:p>
+        </w:tc>
+        <w:tc>
+          <w:tcPr>
+            <w:tcW w:type="dxa" w:w="1728"/>
+            <w:vAlign w:val="center"/>
+            <w:tcBorders>
+              <w:top w:val="nil"/>
+              <w:left w:val="nil"/>
+              <w:bottom w:val="nil"/>
+              <w:right w:val="nil"/>
+              <w:insideH w:val="nil"/>
+              <w:insideV w:val="nil"/>
+            </w:tcBorders>
+          </w:tcPr>
+          <w:p>
+            <w:pPr>
+              <w:jc w:val="center"/>
+            </w:pPr>
+            <w:r>
+              <w:rPr>
+                <w:rFonts w:ascii="Times New Roman" w:hAnsi="Times New Roman"/>
+                <w:sz w:val="20"/>
+              </w:rPr>
+            </w:r>
+          </w:p>
+        </w:tc>
+        <w:tc>
+          <w:tcPr>
+            <w:tcW w:type="dxa" w:w="1728"/>
+            <w:vAlign w:val="center"/>
+            <w:tcBorders>
+              <w:top w:val="nil"/>
+              <w:left w:val="nil"/>
+              <w:bottom w:val="nil"/>
+              <w:right w:val="nil"/>
+              <w:insideH w:val="nil"/>
+              <w:insideV w:val="nil"/>
+            </w:tcBorders>
+          </w:tcPr>
+          <w:p>
+            <w:pPr>
+              <w:jc w:val="center"/>
+            </w:pPr>
+            <w:r>
+              <w:rPr>
+                <w:rFonts w:ascii="Times New Roman" w:hAnsi="Times New Roman"/>
+                <w:sz w:val="20"/>
+              </w:rPr>
+            </w:r>
+          </w:p>
+        </w:tc>
+        <w:tc>
+          <w:tcPr>
+            <w:tcW w:type="dxa" w:w="1728"/>
+            <w:vAlign w:val="center"/>
+            <w:tcBorders>
+              <w:top w:val="nil"/>
+              <w:left w:val="nil"/>
+              <w:bottom w:val="nil"/>
+              <w:right w:val="nil"/>
+              <w:insideH w:val="nil"/>
+              <w:insideV w:val="nil"/>
+            </w:tcBorders>
+          </w:tcPr>
+          <w:p>
+            <w:pPr>
+              <w:jc w:val="center"/>
+            </w:pPr>
+            <w:r>
+              <w:rPr>
+                <w:rFonts w:ascii="Times New Roman" w:hAnsi="Times New Roman"/>
+                <w:sz w:val="20"/>
+              </w:rPr>
+              <w:t>-0.056</w:t>
+            </w:r>
+          </w:p>
+        </w:tc>
+      </w:tr>
+      <w:tr>
+        <w:tc>
+          <w:tcPr>
+            <w:tcW w:type="dxa" w:w="1728"/>
+            <w:vAlign w:val="center"/>
+            <w:tcBorders>
+              <w:top w:val="nil"/>
+              <w:left w:val="nil"/>
+              <w:bottom w:val="nil"/>
+              <w:right w:val="nil"/>
+              <w:insideH w:val="nil"/>
+              <w:insideV w:val="nil"/>
+            </w:tcBorders>
+          </w:tcPr>
+          <w:p>
+            <w:pPr>
+              <w:jc w:val="left"/>
+            </w:pPr>
+            <w:r>
+              <w:rPr>
+                <w:rFonts w:ascii="Times New Roman" w:hAnsi="Times New Roman"/>
+                <w:sz w:val="20"/>
+              </w:rPr>
+            </w:r>
+          </w:p>
+        </w:tc>
+        <w:tc>
+          <w:tcPr>
+            <w:tcW w:type="dxa" w:w="1728"/>
+            <w:vAlign w:val="center"/>
+            <w:tcBorders>
+              <w:top w:val="nil"/>
+              <w:left w:val="nil"/>
+              <w:bottom w:val="nil"/>
+              <w:right w:val="nil"/>
+              <w:insideH w:val="nil"/>
+              <w:insideV w:val="nil"/>
+            </w:tcBorders>
+          </w:tcPr>
+          <w:p>
+            <w:pPr>
+              <w:jc w:val="center"/>
+            </w:pPr>
+            <w:r>
+              <w:rPr>
+                <w:rFonts w:ascii="Times New Roman" w:hAnsi="Times New Roman"/>
+                <w:sz w:val="20"/>
+              </w:rPr>
+            </w:r>
+          </w:p>
+        </w:tc>
+        <w:tc>
+          <w:tcPr>
+            <w:tcW w:type="dxa" w:w="1728"/>
+            <w:vAlign w:val="center"/>
+            <w:tcBorders>
+              <w:top w:val="nil"/>
+              <w:left w:val="nil"/>
+              <w:bottom w:val="nil"/>
+              <w:right w:val="nil"/>
+              <w:insideH w:val="nil"/>
+              <w:insideV w:val="nil"/>
+            </w:tcBorders>
+          </w:tcPr>
+          <w:p>
+            <w:pPr>
+              <w:jc w:val="center"/>
+            </w:pPr>
+            <w:r>
+              <w:rPr>
+                <w:rFonts w:ascii="Times New Roman" w:hAnsi="Times New Roman"/>
+                <w:sz w:val="20"/>
+              </w:rPr>
+            </w:r>
+          </w:p>
+        </w:tc>
+        <w:tc>
+          <w:tcPr>
+            <w:tcW w:type="dxa" w:w="1728"/>
+            <w:vAlign w:val="center"/>
+            <w:tcBorders>
+              <w:top w:val="nil"/>
+              <w:left w:val="nil"/>
+              <w:bottom w:val="nil"/>
+              <w:right w:val="nil"/>
+              <w:insideH w:val="nil"/>
+              <w:insideV w:val="nil"/>
+            </w:tcBorders>
+          </w:tcPr>
+          <w:p>
+            <w:pPr>
+              <w:jc w:val="center"/>
+            </w:pPr>
+            <w:r>
+              <w:rPr>
+                <w:rFonts w:ascii="Times New Roman" w:hAnsi="Times New Roman"/>
+                <w:sz w:val="20"/>
+              </w:rPr>
+            </w:r>
+          </w:p>
+        </w:tc>
+        <w:tc>
+          <w:tcPr>
+            <w:tcW w:type="dxa" w:w="1728"/>
+            <w:vAlign w:val="center"/>
+            <w:tcBorders>
+              <w:top w:val="nil"/>
+              <w:left w:val="nil"/>
+              <w:bottom w:val="nil"/>
+              <w:right w:val="nil"/>
+              <w:insideH w:val="nil"/>
+              <w:insideV w:val="nil"/>
+            </w:tcBorders>
+          </w:tcPr>
+          <w:p>
+            <w:pPr>
+              <w:jc w:val="center"/>
+            </w:pPr>
+            <w:r>
+              <w:rPr>
+                <w:rFonts w:ascii="Times New Roman" w:hAnsi="Times New Roman"/>
+                <w:sz w:val="20"/>
+              </w:rPr>
+              <w:t>(0.051)</w:t>
+            </w:r>
+          </w:p>
+        </w:tc>
+      </w:tr>
+      <w:tr>
+        <w:tc>
+          <w:tcPr>
+            <w:tcW w:type="dxa" w:w="1728"/>
+            <w:vAlign w:val="center"/>
+            <w:tcBorders>
+              <w:top w:val="nil"/>
+              <w:left w:val="nil"/>
+              <w:bottom w:val="nil"/>
+              <w:right w:val="nil"/>
+              <w:insideH w:val="nil"/>
+              <w:insideV w:val="nil"/>
+            </w:tcBorders>
+          </w:tcPr>
+          <w:p>
+            <w:pPr>
+              <w:jc w:val="left"/>
+            </w:pPr>
+            <w:r>
+              <w:rPr>
+                <w:rFonts w:ascii="Times New Roman" w:hAnsi="Times New Roman"/>
+                <w:sz w:val="20"/>
+              </w:rPr>
+              <w:t>reg669</w:t>
+            </w:r>
+          </w:p>
+        </w:tc>
+        <w:tc>
+          <w:tcPr>
+            <w:tcW w:type="dxa" w:w="1728"/>
+            <w:vAlign w:val="center"/>
+            <w:tcBorders>
+              <w:top w:val="nil"/>
+              <w:left w:val="nil"/>
+              <w:bottom w:val="nil"/>
+              <w:right w:val="nil"/>
+              <w:insideH w:val="nil"/>
+              <w:insideV w:val="nil"/>
+            </w:tcBorders>
+          </w:tcPr>
+          <w:p>
+            <w:pPr>
+              <w:jc w:val="center"/>
+            </w:pPr>
+            <w:r>
+              <w:rPr>
+                <w:rFonts w:ascii="Times New Roman" w:hAnsi="Times New Roman"/>
+                <w:sz w:val="20"/>
+              </w:rPr>
+            </w:r>
+          </w:p>
+        </w:tc>
+        <w:tc>
+          <w:tcPr>
+            <w:tcW w:type="dxa" w:w="1728"/>
+            <w:vAlign w:val="center"/>
+            <w:tcBorders>
+              <w:top w:val="nil"/>
+              <w:left w:val="nil"/>
+              <w:bottom w:val="nil"/>
+              <w:right w:val="nil"/>
+              <w:insideH w:val="nil"/>
+              <w:insideV w:val="nil"/>
+            </w:tcBorders>
+          </w:tcPr>
+          <w:p>
+            <w:pPr>
+              <w:jc w:val="center"/>
+            </w:pPr>
+            <w:r>
+              <w:rPr>
+                <w:rFonts w:ascii="Times New Roman" w:hAnsi="Times New Roman"/>
+                <w:sz w:val="20"/>
+              </w:rPr>
+            </w:r>
+          </w:p>
+        </w:tc>
+        <w:tc>
+          <w:tcPr>
+            <w:tcW w:type="dxa" w:w="1728"/>
+            <w:vAlign w:val="center"/>
+            <w:tcBorders>
+              <w:top w:val="nil"/>
+              <w:left w:val="nil"/>
+              <w:bottom w:val="nil"/>
+              <w:right w:val="nil"/>
+              <w:insideH w:val="nil"/>
+              <w:insideV w:val="nil"/>
+            </w:tcBorders>
+          </w:tcPr>
+          <w:p>
+            <w:pPr>
+              <w:jc w:val="center"/>
+            </w:pPr>
+            <w:r>
+              <w:rPr>
+                <w:rFonts w:ascii="Times New Roman" w:hAnsi="Times New Roman"/>
+                <w:sz w:val="20"/>
+              </w:rPr>
+            </w:r>
+          </w:p>
+        </w:tc>
+        <w:tc>
+          <w:tcPr>
+            <w:tcW w:type="dxa" w:w="1728"/>
+            <w:vAlign w:val="center"/>
+            <w:tcBorders>
+              <w:top w:val="nil"/>
+              <w:left w:val="nil"/>
+              <w:bottom w:val="nil"/>
+              <w:right w:val="nil"/>
+              <w:insideH w:val="nil"/>
+              <w:insideV w:val="nil"/>
+            </w:tcBorders>
+          </w:tcPr>
+          <w:p>
+            <w:pPr>
+              <w:jc w:val="center"/>
+            </w:pPr>
+            <w:r>
+              <w:rPr>
+                <w:rFonts w:ascii="Times New Roman" w:hAnsi="Times New Roman"/>
+                <w:sz w:val="20"/>
+              </w:rPr>
+              <w:t>0.119***</w:t>
+            </w:r>
+          </w:p>
+        </w:tc>
+      </w:tr>
+      <w:tr>
+        <w:tc>
+          <w:tcPr>
+            <w:tcW w:type="dxa" w:w="1728"/>
+            <w:vAlign w:val="center"/>
+            <w:tcBorders>
+              <w:top w:val="nil"/>
+              <w:left w:val="nil"/>
+              <w:bottom w:val="nil"/>
+              <w:right w:val="nil"/>
+              <w:insideH w:val="nil"/>
+              <w:insideV w:val="nil"/>
+            </w:tcBorders>
+          </w:tcPr>
+          <w:p>
+            <w:pPr>
+              <w:jc w:val="left"/>
+            </w:pPr>
+            <w:r>
+              <w:rPr>
+                <w:rFonts w:ascii="Times New Roman" w:hAnsi="Times New Roman"/>
+                <w:sz w:val="20"/>
+              </w:rPr>
+            </w:r>
+          </w:p>
+        </w:tc>
+        <w:tc>
+          <w:tcPr>
+            <w:tcW w:type="dxa" w:w="1728"/>
+            <w:vAlign w:val="center"/>
+            <w:tcBorders>
+              <w:top w:val="nil"/>
+              <w:left w:val="nil"/>
+              <w:bottom w:val="nil"/>
+              <w:right w:val="nil"/>
+              <w:insideH w:val="nil"/>
+              <w:insideV w:val="nil"/>
+            </w:tcBorders>
+          </w:tcPr>
+          <w:p>
+            <w:pPr>
+              <w:jc w:val="center"/>
+            </w:pPr>
+            <w:r>
+              <w:rPr>
+                <w:rFonts w:ascii="Times New Roman" w:hAnsi="Times New Roman"/>
+                <w:sz w:val="20"/>
+              </w:rPr>
+            </w:r>
+          </w:p>
+        </w:tc>
+        <w:tc>
+          <w:tcPr>
+            <w:tcW w:type="dxa" w:w="1728"/>
+            <w:vAlign w:val="center"/>
+            <w:tcBorders>
+              <w:top w:val="nil"/>
+              <w:left w:val="nil"/>
+              <w:bottom w:val="nil"/>
+              <w:right w:val="nil"/>
+              <w:insideH w:val="nil"/>
+              <w:insideV w:val="nil"/>
+            </w:tcBorders>
+          </w:tcPr>
+          <w:p>
+            <w:pPr>
+              <w:jc w:val="center"/>
+            </w:pPr>
+            <w:r>
+              <w:rPr>
+                <w:rFonts w:ascii="Times New Roman" w:hAnsi="Times New Roman"/>
+                <w:sz w:val="20"/>
+              </w:rPr>
+            </w:r>
+          </w:p>
+        </w:tc>
+        <w:tc>
+          <w:tcPr>
+            <w:tcW w:type="dxa" w:w="1728"/>
+            <w:vAlign w:val="center"/>
+            <w:tcBorders>
+              <w:top w:val="nil"/>
+              <w:left w:val="nil"/>
+              <w:bottom w:val="nil"/>
+              <w:right w:val="nil"/>
+              <w:insideH w:val="nil"/>
+              <w:insideV w:val="nil"/>
+            </w:tcBorders>
+          </w:tcPr>
+          <w:p>
+            <w:pPr>
+              <w:jc w:val="center"/>
+            </w:pPr>
+            <w:r>
+              <w:rPr>
+                <w:rFonts w:ascii="Times New Roman" w:hAnsi="Times New Roman"/>
+                <w:sz w:val="20"/>
+              </w:rPr>
+            </w:r>
+          </w:p>
+        </w:tc>
+        <w:tc>
+          <w:tcPr>
+            <w:tcW w:type="dxa" w:w="1728"/>
+            <w:vAlign w:val="center"/>
+            <w:tcBorders>
+              <w:top w:val="nil"/>
+              <w:left w:val="nil"/>
+              <w:bottom w:val="nil"/>
+              <w:right w:val="nil"/>
+              <w:insideH w:val="nil"/>
+              <w:insideV w:val="nil"/>
+            </w:tcBorders>
+          </w:tcPr>
+          <w:p>
+            <w:pPr>
+              <w:jc w:val="center"/>
+            </w:pPr>
+            <w:r>
+              <w:rPr>
+                <w:rFonts w:ascii="Times New Roman" w:hAnsi="Times New Roman"/>
+                <w:sz w:val="20"/>
+              </w:rPr>
+              <w:t>(0.039)</w:t>
+            </w:r>
+          </w:p>
+        </w:tc>
+      </w:tr>
+      <w:tr>
+        <w:tc>
+          <w:tcPr>
+            <w:tcW w:type="dxa" w:w="1728"/>
+            <w:vAlign w:val="center"/>
+            <w:tcBorders>
+              <w:top w:val="nil"/>
+              <w:left w:val="nil"/>
+              <w:bottom w:val="nil"/>
+              <w:right w:val="nil"/>
+              <w:insideH w:val="nil"/>
+              <w:insideV w:val="nil"/>
+            </w:tcBorders>
+          </w:tcPr>
+          <w:p>
+            <w:pPr>
+              <w:jc w:val="left"/>
+            </w:pPr>
+            <w:r>
+              <w:rPr>
+                <w:rFonts w:ascii="Times New Roman" w:hAnsi="Times New Roman"/>
+                <w:sz w:val="20"/>
+              </w:rPr>
               <w:t>N</w:t>
             </w:r>
           </w:p>
@@ -696,7 +4571,7 @@
         </w:rPr>
         <w:t>Standard errors in parentheses</w:t>
         <w:br/>
-        <w:t>* p&lt;0.10, ** p&lt;0.05, *** p&lt;0.01</w:t>
+        <w:t>*** p&lt;0.01, ** p&lt;0.05, * p&lt;0.10</w:t>
       </w:r>
     </w:p>
     <w:sectPr>

</xml_diff>